<commit_message>
feat: add steps to enable IAM Identity Center in AWS account setup documentation
</commit_message>
<xml_diff>
--- a/Documentation/How to create a Free AWS account.docx
+++ b/Documentation/How to create a Free AWS account.docx
@@ -76,6 +76,7 @@
       </w:pPr>
       <w:r>
         <w:rPr>
+          <w:noProof/>
           <w:lang w:val="en-US"/>
         </w:rPr>
         <w:drawing>
@@ -141,6 +142,7 @@
       </w:pPr>
       <w:r>
         <w:rPr>
+          <w:noProof/>
           <w:lang w:val="en-US"/>
         </w:rPr>
         <w:lastRenderedPageBreak/>
@@ -208,6 +210,7 @@
       </w:pPr>
       <w:r>
         <w:rPr>
+          <w:noProof/>
           <w:lang w:val="en-US"/>
         </w:rPr>
         <w:lastRenderedPageBreak/>
@@ -274,6 +277,7 @@
       </w:pPr>
       <w:r>
         <w:rPr>
+          <w:noProof/>
           <w:lang w:val="en-US"/>
         </w:rPr>
         <w:lastRenderedPageBreak/>
@@ -340,6 +344,7 @@
       </w:pPr>
       <w:r>
         <w:rPr>
+          <w:noProof/>
           <w:lang w:val="en-US"/>
         </w:rPr>
         <w:lastRenderedPageBreak/>
@@ -811,6 +816,7 @@
       </w:pPr>
       <w:r>
         <w:rPr>
+          <w:noProof/>
           <w:lang w:val="en-US"/>
         </w:rPr>
         <w:lastRenderedPageBreak/>
@@ -1191,6 +1197,7 @@
       </w:pPr>
       <w:r>
         <w:rPr>
+          <w:noProof/>
           <w:lang w:val="en-US"/>
         </w:rPr>
         <w:drawing>
@@ -1266,6 +1273,203 @@
         <w:t>You should now be logged in and on the home page of your AWS account.</w:t>
       </w:r>
     </w:p>
+    <w:p>
+      <w:pPr>
+        <w:pStyle w:val="ListParagraph"/>
+        <w:numPr>
+          <w:ilvl w:val="0"/>
+          <w:numId w:val="2"/>
+        </w:numPr>
+        <w:rPr>
+          <w:lang w:val="en-US"/>
+        </w:rPr>
+      </w:pPr>
+      <w:r>
+        <w:rPr>
+          <w:lang w:val="en-US"/>
+        </w:rPr>
+        <w:t xml:space="preserve">In the </w:t>
+      </w:r>
+      <w:proofErr w:type="spellStart"/>
+      <w:r>
+        <w:rPr>
+          <w:lang w:val="en-US"/>
+        </w:rPr>
+        <w:t>seach</w:t>
+      </w:r>
+      <w:proofErr w:type="spellEnd"/>
+      <w:r>
+        <w:rPr>
+          <w:lang w:val="en-US"/>
+        </w:rPr>
+        <w:t xml:space="preserve"> bar look for IAM Identity center</w:t>
+      </w:r>
+    </w:p>
+    <w:p>
+      <w:pPr>
+        <w:rPr>
+          <w:lang w:val="en-US"/>
+        </w:rPr>
+      </w:pPr>
+      <w:r>
+        <w:rPr>
+          <w:noProof/>
+          <w:lang w:val="en-US"/>
+        </w:rPr>
+        <w:lastRenderedPageBreak/>
+        <w:drawing>
+          <wp:inline distT="0" distB="0" distL="0" distR="0" wp14:anchorId="7C97D312" wp14:editId="5E3AD4DE">
+            <wp:extent cx="5731510" cy="2760345"/>
+            <wp:effectExtent l="0" t="0" r="2540" b="1905"/>
+            <wp:docPr id="1083838811" name="Picture 1"/>
+            <wp:cNvGraphicFramePr>
+              <a:graphicFrameLocks xmlns:a="http://schemas.openxmlformats.org/drawingml/2006/main" noChangeAspect="1"/>
+            </wp:cNvGraphicFramePr>
+            <a:graphic xmlns:a="http://schemas.openxmlformats.org/drawingml/2006/main">
+              <a:graphicData uri="http://schemas.openxmlformats.org/drawingml/2006/picture">
+                <pic:pic xmlns:pic="http://schemas.openxmlformats.org/drawingml/2006/picture">
+                  <pic:nvPicPr>
+                    <pic:cNvPr id="1083838811" name=""/>
+                    <pic:cNvPicPr/>
+                  </pic:nvPicPr>
+                  <pic:blipFill>
+                    <a:blip r:embed="rId13"/>
+                    <a:stretch>
+                      <a:fillRect/>
+                    </a:stretch>
+                  </pic:blipFill>
+                  <pic:spPr>
+                    <a:xfrm>
+                      <a:off x="0" y="0"/>
+                      <a:ext cx="5731510" cy="2760345"/>
+                    </a:xfrm>
+                    <a:prstGeom prst="rect">
+                      <a:avLst/>
+                    </a:prstGeom>
+                  </pic:spPr>
+                </pic:pic>
+              </a:graphicData>
+            </a:graphic>
+          </wp:inline>
+        </w:drawing>
+      </w:r>
+    </w:p>
+    <w:p>
+      <w:pPr>
+        <w:pStyle w:val="ListParagraph"/>
+        <w:numPr>
+          <w:ilvl w:val="0"/>
+          <w:numId w:val="2"/>
+        </w:numPr>
+        <w:rPr>
+          <w:lang w:val="en-US"/>
+        </w:rPr>
+      </w:pPr>
+      <w:r>
+        <w:rPr>
+          <w:lang w:val="en-US"/>
+        </w:rPr>
+        <w:t>Click on “IAM Identity Center”</w:t>
+      </w:r>
+    </w:p>
+    <w:p>
+      <w:pPr>
+        <w:pStyle w:val="ListParagraph"/>
+        <w:numPr>
+          <w:ilvl w:val="0"/>
+          <w:numId w:val="2"/>
+        </w:numPr>
+        <w:rPr>
+          <w:lang w:val="en-US"/>
+        </w:rPr>
+      </w:pPr>
+      <w:r>
+        <w:rPr>
+          <w:lang w:val="en-US"/>
+        </w:rPr>
+        <w:t xml:space="preserve">Click the “enable” button on the side of the screen to enable the identity </w:t>
+      </w:r>
+      <w:r>
+        <w:rPr>
+          <w:lang w:val="en-US"/>
+        </w:rPr>
+        <w:t>center</w:t>
+      </w:r>
+    </w:p>
+    <w:p>
+      <w:pPr>
+        <w:rPr>
+          <w:lang w:val="en-US"/>
+        </w:rPr>
+      </w:pPr>
+      <w:r>
+        <w:rPr>
+          <w:noProof/>
+          <w:lang w:val="en-US"/>
+        </w:rPr>
+        <w:drawing>
+          <wp:inline distT="0" distB="0" distL="0" distR="0" wp14:anchorId="024FDFB3" wp14:editId="4BBE73FB">
+            <wp:extent cx="5731510" cy="3653155"/>
+            <wp:effectExtent l="0" t="0" r="2540" b="4445"/>
+            <wp:docPr id="271272927" name="Picture 1"/>
+            <wp:cNvGraphicFramePr>
+              <a:graphicFrameLocks xmlns:a="http://schemas.openxmlformats.org/drawingml/2006/main" noChangeAspect="1"/>
+            </wp:cNvGraphicFramePr>
+            <a:graphic xmlns:a="http://schemas.openxmlformats.org/drawingml/2006/main">
+              <a:graphicData uri="http://schemas.openxmlformats.org/drawingml/2006/picture">
+                <pic:pic xmlns:pic="http://schemas.openxmlformats.org/drawingml/2006/picture">
+                  <pic:nvPicPr>
+                    <pic:cNvPr id="271272927" name=""/>
+                    <pic:cNvPicPr/>
+                  </pic:nvPicPr>
+                  <pic:blipFill>
+                    <a:blip r:embed="rId14"/>
+                    <a:stretch>
+                      <a:fillRect/>
+                    </a:stretch>
+                  </pic:blipFill>
+                  <pic:spPr>
+                    <a:xfrm>
+                      <a:off x="0" y="0"/>
+                      <a:ext cx="5731510" cy="3653155"/>
+                    </a:xfrm>
+                    <a:prstGeom prst="rect">
+                      <a:avLst/>
+                    </a:prstGeom>
+                  </pic:spPr>
+                </pic:pic>
+              </a:graphicData>
+            </a:graphic>
+          </wp:inline>
+        </w:drawing>
+      </w:r>
+    </w:p>
+    <w:p>
+      <w:pPr>
+        <w:pStyle w:val="ListParagraph"/>
+        <w:numPr>
+          <w:ilvl w:val="0"/>
+          <w:numId w:val="2"/>
+        </w:numPr>
+        <w:rPr>
+          <w:lang w:val="en-US"/>
+        </w:rPr>
+      </w:pPr>
+      <w:r>
+        <w:rPr>
+          <w:lang w:val="en-US"/>
+        </w:rPr>
+        <w:t>IAM Identity Center should now be enabled</w:t>
+      </w:r>
+    </w:p>
+    <w:p>
+      <w:pPr>
+        <w:ind w:left="360"/>
+        <w:rPr>
+          <w:lang w:val="en-US"/>
+        </w:rPr>
+      </w:pPr>
+    </w:p>
     <w:sectPr>
       <w:pgSz w:w="11906" w:h="16838"/>
       <w:pgMar w:top="1440" w:right="1440" w:bottom="1440" w:left="1440" w:header="708" w:footer="708" w:gutter="0"/>
@@ -1368,9 +1572,9 @@
     </w:lvl>
   </w:abstractNum>
   <w:abstractNum w:abstractNumId="1" w15:restartNumberingAfterBreak="0">
-    <w:nsid w:val="7B105A30"/>
+    <w:nsid w:val="259B6936"/>
     <w:multiLevelType w:val="hybridMultilevel"/>
-    <w:tmpl w:val="53B47586"/>
+    <w:tmpl w:val="8B8A8F16"/>
     <w:lvl w:ilvl="0" w:tplc="0C09000F">
       <w:start w:val="1"/>
       <w:numFmt w:val="decimal"/>
@@ -1456,11 +1660,103 @@
       </w:pPr>
     </w:lvl>
   </w:abstractNum>
+  <w:abstractNum w:abstractNumId="2" w15:restartNumberingAfterBreak="0">
+    <w:nsid w:val="7B105A30"/>
+    <w:multiLevelType w:val="hybridMultilevel"/>
+    <w:tmpl w:val="53B47586"/>
+    <w:lvl w:ilvl="0" w:tplc="0C09000F">
+      <w:start w:val="1"/>
+      <w:numFmt w:val="decimal"/>
+      <w:lvlText w:val="%1."/>
+      <w:lvlJc w:val="left"/>
+      <w:pPr>
+        <w:ind w:left="720" w:hanging="360"/>
+      </w:pPr>
+      <w:rPr>
+        <w:rFonts w:hint="default"/>
+      </w:rPr>
+    </w:lvl>
+    <w:lvl w:ilvl="1" w:tplc="0C090019" w:tentative="1">
+      <w:start w:val="1"/>
+      <w:numFmt w:val="lowerLetter"/>
+      <w:lvlText w:val="%2."/>
+      <w:lvlJc w:val="left"/>
+      <w:pPr>
+        <w:ind w:left="1440" w:hanging="360"/>
+      </w:pPr>
+    </w:lvl>
+    <w:lvl w:ilvl="2" w:tplc="0C09001B" w:tentative="1">
+      <w:start w:val="1"/>
+      <w:numFmt w:val="lowerRoman"/>
+      <w:lvlText w:val="%3."/>
+      <w:lvlJc w:val="right"/>
+      <w:pPr>
+        <w:ind w:left="2160" w:hanging="180"/>
+      </w:pPr>
+    </w:lvl>
+    <w:lvl w:ilvl="3" w:tplc="0C09000F" w:tentative="1">
+      <w:start w:val="1"/>
+      <w:numFmt w:val="decimal"/>
+      <w:lvlText w:val="%4."/>
+      <w:lvlJc w:val="left"/>
+      <w:pPr>
+        <w:ind w:left="2880" w:hanging="360"/>
+      </w:pPr>
+    </w:lvl>
+    <w:lvl w:ilvl="4" w:tplc="0C090019" w:tentative="1">
+      <w:start w:val="1"/>
+      <w:numFmt w:val="lowerLetter"/>
+      <w:lvlText w:val="%5."/>
+      <w:lvlJc w:val="left"/>
+      <w:pPr>
+        <w:ind w:left="3600" w:hanging="360"/>
+      </w:pPr>
+    </w:lvl>
+    <w:lvl w:ilvl="5" w:tplc="0C09001B" w:tentative="1">
+      <w:start w:val="1"/>
+      <w:numFmt w:val="lowerRoman"/>
+      <w:lvlText w:val="%6."/>
+      <w:lvlJc w:val="right"/>
+      <w:pPr>
+        <w:ind w:left="4320" w:hanging="180"/>
+      </w:pPr>
+    </w:lvl>
+    <w:lvl w:ilvl="6" w:tplc="0C09000F" w:tentative="1">
+      <w:start w:val="1"/>
+      <w:numFmt w:val="decimal"/>
+      <w:lvlText w:val="%7."/>
+      <w:lvlJc w:val="left"/>
+      <w:pPr>
+        <w:ind w:left="5040" w:hanging="360"/>
+      </w:pPr>
+    </w:lvl>
+    <w:lvl w:ilvl="7" w:tplc="0C090019" w:tentative="1">
+      <w:start w:val="1"/>
+      <w:numFmt w:val="lowerLetter"/>
+      <w:lvlText w:val="%8."/>
+      <w:lvlJc w:val="left"/>
+      <w:pPr>
+        <w:ind w:left="5760" w:hanging="360"/>
+      </w:pPr>
+    </w:lvl>
+    <w:lvl w:ilvl="8" w:tplc="0C09001B" w:tentative="1">
+      <w:start w:val="1"/>
+      <w:numFmt w:val="lowerRoman"/>
+      <w:lvlText w:val="%9."/>
+      <w:lvlJc w:val="right"/>
+      <w:pPr>
+        <w:ind w:left="6480" w:hanging="180"/>
+      </w:pPr>
+    </w:lvl>
+  </w:abstractNum>
   <w:num w:numId="1" w16cid:durableId="1514148031">
-    <w:abstractNumId w:val="1"/>
+    <w:abstractNumId w:val="2"/>
   </w:num>
   <w:num w:numId="2" w16cid:durableId="1364404236">
     <w:abstractNumId w:val="0"/>
+  </w:num>
+  <w:num w:numId="3" w16cid:durableId="1883665804">
+    <w:abstractNumId w:val="1"/>
   </w:num>
 </w:numbering>
 </file>
@@ -2068,6 +2364,7 @@
   <w:style w:type="character" w:default="1" w:styleId="DefaultParagraphFont">
     <w:name w:val="Default Paragraph Font"/>
     <w:uiPriority w:val="1"/>
+    <w:semiHidden/>
     <w:unhideWhenUsed/>
   </w:style>
   <w:style w:type="table" w:default="1" w:styleId="TableNormal">

</xml_diff>

<commit_message>
feat: update documentation for enabling IAM Identity Center and configuring external identity provider in AWS
</commit_message>
<xml_diff>
--- a/Documentation/How to create a Free AWS account.docx
+++ b/Documentation/How to create a Free AWS account.docx
@@ -1275,10 +1275,31 @@
     </w:p>
     <w:p>
       <w:pPr>
+        <w:pStyle w:val="Title"/>
+        <w:rPr>
+          <w:lang w:val="en-US"/>
+        </w:rPr>
+      </w:pPr>
+      <w:r>
+        <w:rPr>
+          <w:lang w:val="en-US"/>
+        </w:rPr>
+        <w:t>How to create working Identity source in AWS</w:t>
+      </w:r>
+    </w:p>
+    <w:p>
+      <w:pPr>
+        <w:rPr>
+          <w:lang w:val="en-US"/>
+        </w:rPr>
+      </w:pPr>
+    </w:p>
+    <w:p>
+      <w:pPr>
         <w:pStyle w:val="ListParagraph"/>
         <w:numPr>
           <w:ilvl w:val="0"/>
-          <w:numId w:val="2"/>
+          <w:numId w:val="3"/>
         </w:numPr>
         <w:rPr>
           <w:lang w:val="en-US"/>
@@ -1288,25 +1309,12 @@
         <w:rPr>
           <w:lang w:val="en-US"/>
         </w:rPr>
-        <w:t xml:space="preserve">In the </w:t>
-      </w:r>
-      <w:proofErr w:type="spellStart"/>
-      <w:r>
-        <w:rPr>
-          <w:lang w:val="en-US"/>
-        </w:rPr>
-        <w:t>seach</w:t>
-      </w:r>
-      <w:proofErr w:type="spellEnd"/>
-      <w:r>
-        <w:rPr>
-          <w:lang w:val="en-US"/>
-        </w:rPr>
-        <w:t xml:space="preserve"> bar look for IAM Identity center</w:t>
-      </w:r>
-    </w:p>
-    <w:p>
-      <w:pPr>
+        <w:t>Navigate to IAM identity center</w:t>
+      </w:r>
+    </w:p>
+    <w:p>
+      <w:pPr>
+        <w:ind w:left="360"/>
         <w:rPr>
           <w:lang w:val="en-US"/>
         </w:rPr>
@@ -1318,7 +1326,7 @@
         </w:rPr>
         <w:lastRenderedPageBreak/>
         <w:drawing>
-          <wp:inline distT="0" distB="0" distL="0" distR="0" wp14:anchorId="7C97D312" wp14:editId="5E3AD4DE">
+          <wp:inline distT="0" distB="0" distL="0" distR="0" wp14:anchorId="437628AD" wp14:editId="270353DC">
             <wp:extent cx="5731510" cy="2760345"/>
             <wp:effectExtent l="0" t="0" r="2540" b="1905"/>
             <wp:docPr id="1083838811" name="Picture 1"/>
@@ -1359,7 +1367,7 @@
         <w:pStyle w:val="ListParagraph"/>
         <w:numPr>
           <w:ilvl w:val="0"/>
-          <w:numId w:val="2"/>
+          <w:numId w:val="3"/>
         </w:numPr>
         <w:rPr>
           <w:lang w:val="en-US"/>
@@ -1369,35 +1377,20 @@
         <w:rPr>
           <w:lang w:val="en-US"/>
         </w:rPr>
-        <w:t>Click on “IAM Identity Center”</w:t>
-      </w:r>
-    </w:p>
-    <w:p>
-      <w:pPr>
-        <w:pStyle w:val="ListParagraph"/>
-        <w:numPr>
-          <w:ilvl w:val="0"/>
-          <w:numId w:val="2"/>
-        </w:numPr>
-        <w:rPr>
-          <w:lang w:val="en-US"/>
-        </w:rPr>
-      </w:pPr>
-      <w:r>
-        <w:rPr>
-          <w:lang w:val="en-US"/>
-        </w:rPr>
-        <w:t xml:space="preserve">Click the “enable” button on the side of the screen to enable the identity </w:t>
-      </w:r>
-      <w:r>
-        <w:rPr>
-          <w:lang w:val="en-US"/>
-        </w:rPr>
-        <w:t>center</w:t>
-      </w:r>
-    </w:p>
-    <w:p>
-      <w:pPr>
+        <w:t>Click the “enable” button on the side of the screen to enable the identity centre</w:t>
+      </w:r>
+    </w:p>
+    <w:p>
+      <w:pPr>
+        <w:ind w:left="360"/>
+        <w:rPr>
+          <w:lang w:val="en-US"/>
+        </w:rPr>
+      </w:pPr>
+    </w:p>
+    <w:p>
+      <w:pPr>
+        <w:ind w:left="360"/>
         <w:rPr>
           <w:lang w:val="en-US"/>
         </w:rPr>
@@ -1408,7 +1401,7 @@
           <w:lang w:val="en-US"/>
         </w:rPr>
         <w:drawing>
-          <wp:inline distT="0" distB="0" distL="0" distR="0" wp14:anchorId="024FDFB3" wp14:editId="4BBE73FB">
+          <wp:inline distT="0" distB="0" distL="0" distR="0" wp14:anchorId="45B4DEB0" wp14:editId="46CFCF84">
             <wp:extent cx="5731510" cy="3653155"/>
             <wp:effectExtent l="0" t="0" r="2540" b="4445"/>
             <wp:docPr id="271272927" name="Picture 1"/>
@@ -1449,7 +1442,7 @@
         <w:pStyle w:val="ListParagraph"/>
         <w:numPr>
           <w:ilvl w:val="0"/>
-          <w:numId w:val="2"/>
+          <w:numId w:val="3"/>
         </w:numPr>
         <w:rPr>
           <w:lang w:val="en-US"/>
@@ -1459,16 +1452,1000 @@
         <w:rPr>
           <w:lang w:val="en-US"/>
         </w:rPr>
-        <w:t>IAM Identity Center should now be enabled</w:t>
-      </w:r>
-    </w:p>
-    <w:p>
-      <w:pPr>
-        <w:ind w:left="360"/>
-        <w:rPr>
-          <w:lang w:val="en-US"/>
-        </w:rPr>
-      </w:pPr>
+        <w:t>Click “enable” again on the confirmation screen</w:t>
+      </w:r>
+    </w:p>
+    <w:p>
+      <w:pPr>
+        <w:pStyle w:val="ListParagraph"/>
+        <w:numPr>
+          <w:ilvl w:val="0"/>
+          <w:numId w:val="3"/>
+        </w:numPr>
+        <w:rPr>
+          <w:lang w:val="en-US"/>
+        </w:rPr>
+      </w:pPr>
+      <w:r>
+        <w:rPr>
+          <w:lang w:val="en-US"/>
+        </w:rPr>
+        <w:t>On the dashboard click on the “go to settings” button</w:t>
+      </w:r>
+    </w:p>
+    <w:p>
+      <w:pPr>
+        <w:rPr>
+          <w:lang w:val="en-US"/>
+        </w:rPr>
+      </w:pPr>
+      <w:r>
+        <w:rPr>
+          <w:noProof/>
+          <w:lang w:val="en-US"/>
+        </w:rPr>
+        <w:lastRenderedPageBreak/>
+        <w:drawing>
+          <wp:inline distT="0" distB="0" distL="0" distR="0" wp14:anchorId="2D58E308" wp14:editId="460A68D9">
+            <wp:extent cx="5731510" cy="1284605"/>
+            <wp:effectExtent l="0" t="0" r="2540" b="0"/>
+            <wp:docPr id="534442743" name="Picture 1"/>
+            <wp:cNvGraphicFramePr>
+              <a:graphicFrameLocks xmlns:a="http://schemas.openxmlformats.org/drawingml/2006/main" noChangeAspect="1"/>
+            </wp:cNvGraphicFramePr>
+            <a:graphic xmlns:a="http://schemas.openxmlformats.org/drawingml/2006/main">
+              <a:graphicData uri="http://schemas.openxmlformats.org/drawingml/2006/picture">
+                <pic:pic xmlns:pic="http://schemas.openxmlformats.org/drawingml/2006/picture">
+                  <pic:nvPicPr>
+                    <pic:cNvPr id="534442743" name=""/>
+                    <pic:cNvPicPr/>
+                  </pic:nvPicPr>
+                  <pic:blipFill>
+                    <a:blip r:embed="rId15"/>
+                    <a:stretch>
+                      <a:fillRect/>
+                    </a:stretch>
+                  </pic:blipFill>
+                  <pic:spPr>
+                    <a:xfrm>
+                      <a:off x="0" y="0"/>
+                      <a:ext cx="5731510" cy="1284605"/>
+                    </a:xfrm>
+                    <a:prstGeom prst="rect">
+                      <a:avLst/>
+                    </a:prstGeom>
+                  </pic:spPr>
+                </pic:pic>
+              </a:graphicData>
+            </a:graphic>
+          </wp:inline>
+        </w:drawing>
+      </w:r>
+    </w:p>
+    <w:p>
+      <w:pPr>
+        <w:pStyle w:val="ListParagraph"/>
+        <w:numPr>
+          <w:ilvl w:val="0"/>
+          <w:numId w:val="3"/>
+        </w:numPr>
+        <w:rPr>
+          <w:lang w:val="en-US"/>
+        </w:rPr>
+      </w:pPr>
+      <w:r>
+        <w:rPr>
+          <w:lang w:val="en-US"/>
+        </w:rPr>
+        <w:t>Scroll down to Identity source and then click on Actions and then click “change Identity source”</w:t>
+      </w:r>
+    </w:p>
+    <w:p>
+      <w:pPr>
+        <w:rPr>
+          <w:lang w:val="en-US"/>
+        </w:rPr>
+      </w:pPr>
+      <w:r>
+        <w:rPr>
+          <w:noProof/>
+          <w:lang w:val="en-US"/>
+        </w:rPr>
+        <w:drawing>
+          <wp:inline distT="0" distB="0" distL="0" distR="0" wp14:anchorId="1865167D" wp14:editId="791C8216">
+            <wp:extent cx="5731510" cy="1691005"/>
+            <wp:effectExtent l="0" t="0" r="2540" b="4445"/>
+            <wp:docPr id="1228420389" name="Picture 1"/>
+            <wp:cNvGraphicFramePr>
+              <a:graphicFrameLocks xmlns:a="http://schemas.openxmlformats.org/drawingml/2006/main" noChangeAspect="1"/>
+            </wp:cNvGraphicFramePr>
+            <a:graphic xmlns:a="http://schemas.openxmlformats.org/drawingml/2006/main">
+              <a:graphicData uri="http://schemas.openxmlformats.org/drawingml/2006/picture">
+                <pic:pic xmlns:pic="http://schemas.openxmlformats.org/drawingml/2006/picture">
+                  <pic:nvPicPr>
+                    <pic:cNvPr id="1228420389" name=""/>
+                    <pic:cNvPicPr/>
+                  </pic:nvPicPr>
+                  <pic:blipFill>
+                    <a:blip r:embed="rId16"/>
+                    <a:stretch>
+                      <a:fillRect/>
+                    </a:stretch>
+                  </pic:blipFill>
+                  <pic:spPr>
+                    <a:xfrm>
+                      <a:off x="0" y="0"/>
+                      <a:ext cx="5731510" cy="1691005"/>
+                    </a:xfrm>
+                    <a:prstGeom prst="rect">
+                      <a:avLst/>
+                    </a:prstGeom>
+                  </pic:spPr>
+                </pic:pic>
+              </a:graphicData>
+            </a:graphic>
+          </wp:inline>
+        </w:drawing>
+      </w:r>
+    </w:p>
+    <w:p>
+      <w:pPr>
+        <w:pStyle w:val="ListParagraph"/>
+        <w:numPr>
+          <w:ilvl w:val="0"/>
+          <w:numId w:val="3"/>
+        </w:numPr>
+        <w:rPr>
+          <w:lang w:val="en-US"/>
+        </w:rPr>
+      </w:pPr>
+      <w:r>
+        <w:rPr>
+          <w:lang w:val="en-US"/>
+        </w:rPr>
+        <w:t>Select External identity provider and then click next.</w:t>
+      </w:r>
+    </w:p>
+    <w:p>
+      <w:pPr>
+        <w:rPr>
+          <w:lang w:val="en-US"/>
+        </w:rPr>
+      </w:pPr>
+      <w:r>
+        <w:rPr>
+          <w:noProof/>
+          <w:lang w:val="en-US"/>
+        </w:rPr>
+        <w:drawing>
+          <wp:inline distT="0" distB="0" distL="0" distR="0" wp14:anchorId="55B78D89" wp14:editId="7DBDB13C">
+            <wp:extent cx="5731510" cy="1657350"/>
+            <wp:effectExtent l="0" t="0" r="2540" b="0"/>
+            <wp:docPr id="1470109259" name="Picture 1"/>
+            <wp:cNvGraphicFramePr>
+              <a:graphicFrameLocks xmlns:a="http://schemas.openxmlformats.org/drawingml/2006/main" noChangeAspect="1"/>
+            </wp:cNvGraphicFramePr>
+            <a:graphic xmlns:a="http://schemas.openxmlformats.org/drawingml/2006/main">
+              <a:graphicData uri="http://schemas.openxmlformats.org/drawingml/2006/picture">
+                <pic:pic xmlns:pic="http://schemas.openxmlformats.org/drawingml/2006/picture">
+                  <pic:nvPicPr>
+                    <pic:cNvPr id="1470109259" name=""/>
+                    <pic:cNvPicPr/>
+                  </pic:nvPicPr>
+                  <pic:blipFill>
+                    <a:blip r:embed="rId17"/>
+                    <a:stretch>
+                      <a:fillRect/>
+                    </a:stretch>
+                  </pic:blipFill>
+                  <pic:spPr>
+                    <a:xfrm>
+                      <a:off x="0" y="0"/>
+                      <a:ext cx="5731510" cy="1657350"/>
+                    </a:xfrm>
+                    <a:prstGeom prst="rect">
+                      <a:avLst/>
+                    </a:prstGeom>
+                  </pic:spPr>
+                </pic:pic>
+              </a:graphicData>
+            </a:graphic>
+          </wp:inline>
+        </w:drawing>
+      </w:r>
+    </w:p>
+    <w:p>
+      <w:pPr>
+        <w:pStyle w:val="ListParagraph"/>
+        <w:numPr>
+          <w:ilvl w:val="0"/>
+          <w:numId w:val="3"/>
+        </w:numPr>
+        <w:rPr>
+          <w:lang w:val="en-US"/>
+        </w:rPr>
+      </w:pPr>
+      <w:r>
+        <w:rPr>
+          <w:lang w:val="en-US"/>
+        </w:rPr>
+        <w:t>Once on the Configure external identity provider page select “Dual-stack”</w:t>
+      </w:r>
+    </w:p>
+    <w:p>
+      <w:pPr>
+        <w:rPr>
+          <w:lang w:val="en-US"/>
+        </w:rPr>
+      </w:pPr>
+      <w:r>
+        <w:rPr>
+          <w:noProof/>
+          <w:lang w:val="en-US"/>
+        </w:rPr>
+        <w:drawing>
+          <wp:inline distT="0" distB="0" distL="0" distR="0" wp14:anchorId="71453D49" wp14:editId="084D0858">
+            <wp:extent cx="5731510" cy="1034415"/>
+            <wp:effectExtent l="0" t="0" r="2540" b="0"/>
+            <wp:docPr id="826964576" name="Picture 1"/>
+            <wp:cNvGraphicFramePr>
+              <a:graphicFrameLocks xmlns:a="http://schemas.openxmlformats.org/drawingml/2006/main" noChangeAspect="1"/>
+            </wp:cNvGraphicFramePr>
+            <a:graphic xmlns:a="http://schemas.openxmlformats.org/drawingml/2006/main">
+              <a:graphicData uri="http://schemas.openxmlformats.org/drawingml/2006/picture">
+                <pic:pic xmlns:pic="http://schemas.openxmlformats.org/drawingml/2006/picture">
+                  <pic:nvPicPr>
+                    <pic:cNvPr id="826964576" name=""/>
+                    <pic:cNvPicPr/>
+                  </pic:nvPicPr>
+                  <pic:blipFill>
+                    <a:blip r:embed="rId18"/>
+                    <a:stretch>
+                      <a:fillRect/>
+                    </a:stretch>
+                  </pic:blipFill>
+                  <pic:spPr>
+                    <a:xfrm>
+                      <a:off x="0" y="0"/>
+                      <a:ext cx="5731510" cy="1034415"/>
+                    </a:xfrm>
+                    <a:prstGeom prst="rect">
+                      <a:avLst/>
+                    </a:prstGeom>
+                  </pic:spPr>
+                </pic:pic>
+              </a:graphicData>
+            </a:graphic>
+          </wp:inline>
+        </w:drawing>
+      </w:r>
+    </w:p>
+    <w:p>
+      <w:pPr>
+        <w:pStyle w:val="ListParagraph"/>
+        <w:numPr>
+          <w:ilvl w:val="0"/>
+          <w:numId w:val="3"/>
+        </w:numPr>
+        <w:rPr>
+          <w:lang w:val="en-US"/>
+        </w:rPr>
+      </w:pPr>
+      <w:r>
+        <w:rPr>
+          <w:lang w:val="en-US"/>
+        </w:rPr>
+        <w:t>Click on the Download metadata file</w:t>
+      </w:r>
+    </w:p>
+    <w:p>
+      <w:pPr>
+        <w:rPr>
+          <w:lang w:val="en-US"/>
+        </w:rPr>
+      </w:pPr>
+      <w:r>
+        <w:rPr>
+          <w:noProof/>
+          <w:lang w:val="en-US"/>
+        </w:rPr>
+        <w:lastRenderedPageBreak/>
+        <w:drawing>
+          <wp:inline distT="0" distB="0" distL="0" distR="0" wp14:anchorId="0E45BDF6" wp14:editId="24953D5E">
+            <wp:extent cx="5731510" cy="1783080"/>
+            <wp:effectExtent l="0" t="0" r="2540" b="7620"/>
+            <wp:docPr id="193081436" name="Picture 1"/>
+            <wp:cNvGraphicFramePr>
+              <a:graphicFrameLocks xmlns:a="http://schemas.openxmlformats.org/drawingml/2006/main" noChangeAspect="1"/>
+            </wp:cNvGraphicFramePr>
+            <a:graphic xmlns:a="http://schemas.openxmlformats.org/drawingml/2006/main">
+              <a:graphicData uri="http://schemas.openxmlformats.org/drawingml/2006/picture">
+                <pic:pic xmlns:pic="http://schemas.openxmlformats.org/drawingml/2006/picture">
+                  <pic:nvPicPr>
+                    <pic:cNvPr id="193081436" name=""/>
+                    <pic:cNvPicPr/>
+                  </pic:nvPicPr>
+                  <pic:blipFill>
+                    <a:blip r:embed="rId19"/>
+                    <a:stretch>
+                      <a:fillRect/>
+                    </a:stretch>
+                  </pic:blipFill>
+                  <pic:spPr>
+                    <a:xfrm>
+                      <a:off x="0" y="0"/>
+                      <a:ext cx="5731510" cy="1783080"/>
+                    </a:xfrm>
+                    <a:prstGeom prst="rect">
+                      <a:avLst/>
+                    </a:prstGeom>
+                  </pic:spPr>
+                </pic:pic>
+              </a:graphicData>
+            </a:graphic>
+          </wp:inline>
+        </w:drawing>
+      </w:r>
+    </w:p>
+    <w:p>
+      <w:pPr>
+        <w:pStyle w:val="ListParagraph"/>
+        <w:numPr>
+          <w:ilvl w:val="0"/>
+          <w:numId w:val="3"/>
+        </w:numPr>
+        <w:rPr>
+          <w:lang w:val="en-US"/>
+        </w:rPr>
+      </w:pPr>
+      <w:r>
+        <w:rPr>
+          <w:lang w:val="en-US"/>
+        </w:rPr>
+        <w:t>Then you must navigate to Azure Entra and go to your enterprise applications</w:t>
+      </w:r>
+    </w:p>
+    <w:p>
+      <w:pPr>
+        <w:rPr>
+          <w:lang w:val="en-US"/>
+        </w:rPr>
+      </w:pPr>
+      <w:r>
+        <w:rPr>
+          <w:noProof/>
+          <w:lang w:val="en-US"/>
+        </w:rPr>
+        <w:drawing>
+          <wp:inline distT="0" distB="0" distL="0" distR="0" wp14:anchorId="0C5FFF11" wp14:editId="59C8E054">
+            <wp:extent cx="2486372" cy="3086531"/>
+            <wp:effectExtent l="0" t="0" r="9525" b="0"/>
+            <wp:docPr id="2115718579" name="Picture 1"/>
+            <wp:cNvGraphicFramePr>
+              <a:graphicFrameLocks xmlns:a="http://schemas.openxmlformats.org/drawingml/2006/main" noChangeAspect="1"/>
+            </wp:cNvGraphicFramePr>
+            <a:graphic xmlns:a="http://schemas.openxmlformats.org/drawingml/2006/main">
+              <a:graphicData uri="http://schemas.openxmlformats.org/drawingml/2006/picture">
+                <pic:pic xmlns:pic="http://schemas.openxmlformats.org/drawingml/2006/picture">
+                  <pic:nvPicPr>
+                    <pic:cNvPr id="2115718579" name=""/>
+                    <pic:cNvPicPr/>
+                  </pic:nvPicPr>
+                  <pic:blipFill>
+                    <a:blip r:embed="rId20"/>
+                    <a:stretch>
+                      <a:fillRect/>
+                    </a:stretch>
+                  </pic:blipFill>
+                  <pic:spPr>
+                    <a:xfrm>
+                      <a:off x="0" y="0"/>
+                      <a:ext cx="2486372" cy="3086531"/>
+                    </a:xfrm>
+                    <a:prstGeom prst="rect">
+                      <a:avLst/>
+                    </a:prstGeom>
+                  </pic:spPr>
+                </pic:pic>
+              </a:graphicData>
+            </a:graphic>
+          </wp:inline>
+        </w:drawing>
+      </w:r>
+    </w:p>
+    <w:p>
+      <w:pPr>
+        <w:pStyle w:val="ListParagraph"/>
+        <w:numPr>
+          <w:ilvl w:val="0"/>
+          <w:numId w:val="3"/>
+        </w:numPr>
+        <w:rPr>
+          <w:lang w:val="en-US"/>
+        </w:rPr>
+      </w:pPr>
+      <w:r>
+        <w:rPr>
+          <w:lang w:val="en-US"/>
+        </w:rPr>
+        <w:t>Find the SSO application that was created by c20 (AWS SSO Corp)</w:t>
+      </w:r>
+    </w:p>
+    <w:p>
+      <w:pPr>
+        <w:pStyle w:val="ListParagraph"/>
+        <w:numPr>
+          <w:ilvl w:val="0"/>
+          <w:numId w:val="3"/>
+        </w:numPr>
+        <w:rPr>
+          <w:lang w:val="en-US"/>
+        </w:rPr>
+      </w:pPr>
+      <w:r>
+        <w:rPr>
+          <w:lang w:val="en-US"/>
+        </w:rPr>
+        <w:t>Navigate to single sign-on</w:t>
+      </w:r>
+    </w:p>
+    <w:p>
+      <w:pPr>
+        <w:rPr>
+          <w:lang w:val="en-US"/>
+        </w:rPr>
+      </w:pPr>
+      <w:r>
+        <w:rPr>
+          <w:noProof/>
+          <w:lang w:val="en-US"/>
+        </w:rPr>
+        <w:lastRenderedPageBreak/>
+        <w:drawing>
+          <wp:inline distT="0" distB="0" distL="0" distR="0" wp14:anchorId="0A52D65A" wp14:editId="26F5FA63">
+            <wp:extent cx="2429214" cy="5153744"/>
+            <wp:effectExtent l="0" t="0" r="9525" b="8890"/>
+            <wp:docPr id="322285919" name="Picture 1"/>
+            <wp:cNvGraphicFramePr>
+              <a:graphicFrameLocks xmlns:a="http://schemas.openxmlformats.org/drawingml/2006/main" noChangeAspect="1"/>
+            </wp:cNvGraphicFramePr>
+            <a:graphic xmlns:a="http://schemas.openxmlformats.org/drawingml/2006/main">
+              <a:graphicData uri="http://schemas.openxmlformats.org/drawingml/2006/picture">
+                <pic:pic xmlns:pic="http://schemas.openxmlformats.org/drawingml/2006/picture">
+                  <pic:nvPicPr>
+                    <pic:cNvPr id="322285919" name=""/>
+                    <pic:cNvPicPr/>
+                  </pic:nvPicPr>
+                  <pic:blipFill>
+                    <a:blip r:embed="rId21"/>
+                    <a:stretch>
+                      <a:fillRect/>
+                    </a:stretch>
+                  </pic:blipFill>
+                  <pic:spPr>
+                    <a:xfrm>
+                      <a:off x="0" y="0"/>
+                      <a:ext cx="2429214" cy="5153744"/>
+                    </a:xfrm>
+                    <a:prstGeom prst="rect">
+                      <a:avLst/>
+                    </a:prstGeom>
+                  </pic:spPr>
+                </pic:pic>
+              </a:graphicData>
+            </a:graphic>
+          </wp:inline>
+        </w:drawing>
+      </w:r>
+    </w:p>
+    <w:p>
+      <w:pPr>
+        <w:pStyle w:val="ListParagraph"/>
+        <w:numPr>
+          <w:ilvl w:val="0"/>
+          <w:numId w:val="3"/>
+        </w:numPr>
+        <w:rPr>
+          <w:lang w:val="en-US"/>
+        </w:rPr>
+      </w:pPr>
+      <w:r>
+        <w:rPr>
+          <w:lang w:val="en-US"/>
+        </w:rPr>
+        <w:t>Choose SAML</w:t>
+      </w:r>
+    </w:p>
+    <w:p>
+      <w:pPr>
+        <w:rPr>
+          <w:lang w:val="en-US"/>
+        </w:rPr>
+      </w:pPr>
+      <w:r>
+        <w:rPr>
+          <w:noProof/>
+          <w:lang w:val="en-US"/>
+        </w:rPr>
+        <w:drawing>
+          <wp:inline distT="0" distB="0" distL="0" distR="0" wp14:anchorId="45936A93" wp14:editId="436C7599">
+            <wp:extent cx="5731510" cy="1936115"/>
+            <wp:effectExtent l="0" t="0" r="2540" b="6985"/>
+            <wp:docPr id="361738957" name="Picture 1"/>
+            <wp:cNvGraphicFramePr>
+              <a:graphicFrameLocks xmlns:a="http://schemas.openxmlformats.org/drawingml/2006/main" noChangeAspect="1"/>
+            </wp:cNvGraphicFramePr>
+            <a:graphic xmlns:a="http://schemas.openxmlformats.org/drawingml/2006/main">
+              <a:graphicData uri="http://schemas.openxmlformats.org/drawingml/2006/picture">
+                <pic:pic xmlns:pic="http://schemas.openxmlformats.org/drawingml/2006/picture">
+                  <pic:nvPicPr>
+                    <pic:cNvPr id="361738957" name=""/>
+                    <pic:cNvPicPr/>
+                  </pic:nvPicPr>
+                  <pic:blipFill>
+                    <a:blip r:embed="rId22"/>
+                    <a:stretch>
+                      <a:fillRect/>
+                    </a:stretch>
+                  </pic:blipFill>
+                  <pic:spPr>
+                    <a:xfrm>
+                      <a:off x="0" y="0"/>
+                      <a:ext cx="5731510" cy="1936115"/>
+                    </a:xfrm>
+                    <a:prstGeom prst="rect">
+                      <a:avLst/>
+                    </a:prstGeom>
+                  </pic:spPr>
+                </pic:pic>
+              </a:graphicData>
+            </a:graphic>
+          </wp:inline>
+        </w:drawing>
+      </w:r>
+    </w:p>
+    <w:p>
+      <w:pPr>
+        <w:pStyle w:val="ListParagraph"/>
+        <w:numPr>
+          <w:ilvl w:val="0"/>
+          <w:numId w:val="3"/>
+        </w:numPr>
+        <w:rPr>
+          <w:lang w:val="en-US"/>
+        </w:rPr>
+      </w:pPr>
+      <w:r>
+        <w:rPr>
+          <w:lang w:val="en-US"/>
+        </w:rPr>
+        <w:t>Click the “upload media file button” (IMPORTANT: make sure you have the required role to edit the enterprise application file like “Global Administrator”)</w:t>
+      </w:r>
+    </w:p>
+    <w:p>
+      <w:pPr>
+        <w:pStyle w:val="ListParagraph"/>
+        <w:numPr>
+          <w:ilvl w:val="0"/>
+          <w:numId w:val="3"/>
+        </w:numPr>
+        <w:rPr>
+          <w:lang w:val="en-US"/>
+        </w:rPr>
+      </w:pPr>
+      <w:r>
+        <w:rPr>
+          <w:lang w:val="en-US"/>
+        </w:rPr>
+        <w:t>Upload the metadata file you downloaded from IAM identity provider</w:t>
+      </w:r>
+    </w:p>
+    <w:p>
+      <w:pPr>
+        <w:pStyle w:val="ListParagraph"/>
+        <w:numPr>
+          <w:ilvl w:val="0"/>
+          <w:numId w:val="3"/>
+        </w:numPr>
+        <w:rPr>
+          <w:lang w:val="en-US"/>
+        </w:rPr>
+      </w:pPr>
+      <w:r>
+        <w:rPr>
+          <w:lang w:val="en-US"/>
+        </w:rPr>
+        <w:t>Click the save button</w:t>
+      </w:r>
+    </w:p>
+    <w:p>
+      <w:pPr>
+        <w:rPr>
+          <w:lang w:val="en-US"/>
+        </w:rPr>
+      </w:pPr>
+      <w:r>
+        <w:rPr>
+          <w:noProof/>
+          <w:lang w:val="en-US"/>
+        </w:rPr>
+        <w:lastRenderedPageBreak/>
+        <w:drawing>
+          <wp:inline distT="0" distB="0" distL="0" distR="0" wp14:anchorId="32E85383" wp14:editId="15D895C5">
+            <wp:extent cx="5731510" cy="1574800"/>
+            <wp:effectExtent l="0" t="0" r="2540" b="6350"/>
+            <wp:docPr id="1561802242" name="Picture 1"/>
+            <wp:cNvGraphicFramePr>
+              <a:graphicFrameLocks xmlns:a="http://schemas.openxmlformats.org/drawingml/2006/main" noChangeAspect="1"/>
+            </wp:cNvGraphicFramePr>
+            <a:graphic xmlns:a="http://schemas.openxmlformats.org/drawingml/2006/main">
+              <a:graphicData uri="http://schemas.openxmlformats.org/drawingml/2006/picture">
+                <pic:pic xmlns:pic="http://schemas.openxmlformats.org/drawingml/2006/picture">
+                  <pic:nvPicPr>
+                    <pic:cNvPr id="1561802242" name=""/>
+                    <pic:cNvPicPr/>
+                  </pic:nvPicPr>
+                  <pic:blipFill>
+                    <a:blip r:embed="rId23"/>
+                    <a:stretch>
+                      <a:fillRect/>
+                    </a:stretch>
+                  </pic:blipFill>
+                  <pic:spPr>
+                    <a:xfrm>
+                      <a:off x="0" y="0"/>
+                      <a:ext cx="5731510" cy="1574800"/>
+                    </a:xfrm>
+                    <a:prstGeom prst="rect">
+                      <a:avLst/>
+                    </a:prstGeom>
+                  </pic:spPr>
+                </pic:pic>
+              </a:graphicData>
+            </a:graphic>
+          </wp:inline>
+        </w:drawing>
+      </w:r>
+    </w:p>
+    <w:p>
+      <w:pPr>
+        <w:pStyle w:val="ListParagraph"/>
+        <w:numPr>
+          <w:ilvl w:val="0"/>
+          <w:numId w:val="3"/>
+        </w:numPr>
+        <w:rPr>
+          <w:lang w:val="en-US"/>
+        </w:rPr>
+      </w:pPr>
+      <w:r>
+        <w:rPr>
+          <w:lang w:val="en-US"/>
+        </w:rPr>
+        <w:t>Scroll down to SAML Certificates and download the federation Metadata XML</w:t>
+      </w:r>
+    </w:p>
+    <w:p>
+      <w:pPr>
+        <w:rPr>
+          <w:lang w:val="en-US"/>
+        </w:rPr>
+      </w:pPr>
+      <w:r>
+        <w:rPr>
+          <w:noProof/>
+          <w:lang w:val="en-US"/>
+        </w:rPr>
+        <w:drawing>
+          <wp:inline distT="0" distB="0" distL="0" distR="0" wp14:anchorId="30F65D7D" wp14:editId="766D63B7">
+            <wp:extent cx="5731510" cy="2066925"/>
+            <wp:effectExtent l="0" t="0" r="2540" b="9525"/>
+            <wp:docPr id="285286611" name="Picture 1"/>
+            <wp:cNvGraphicFramePr>
+              <a:graphicFrameLocks xmlns:a="http://schemas.openxmlformats.org/drawingml/2006/main" noChangeAspect="1"/>
+            </wp:cNvGraphicFramePr>
+            <a:graphic xmlns:a="http://schemas.openxmlformats.org/drawingml/2006/main">
+              <a:graphicData uri="http://schemas.openxmlformats.org/drawingml/2006/picture">
+                <pic:pic xmlns:pic="http://schemas.openxmlformats.org/drawingml/2006/picture">
+                  <pic:nvPicPr>
+                    <pic:cNvPr id="285286611" name=""/>
+                    <pic:cNvPicPr/>
+                  </pic:nvPicPr>
+                  <pic:blipFill rotWithShape="1">
+                    <a:blip r:embed="rId24"/>
+                    <a:srcRect b="27666"/>
+                    <a:stretch>
+                      <a:fillRect/>
+                    </a:stretch>
+                  </pic:blipFill>
+                  <pic:spPr bwMode="auto">
+                    <a:xfrm>
+                      <a:off x="0" y="0"/>
+                      <a:ext cx="5731510" cy="2066925"/>
+                    </a:xfrm>
+                    <a:prstGeom prst="rect">
+                      <a:avLst/>
+                    </a:prstGeom>
+                    <a:ln>
+                      <a:noFill/>
+                    </a:ln>
+                    <a:extLst>
+                      <a:ext uri="{53640926-AAD7-44D8-BBD7-CCE9431645EC}">
+                        <a14:shadowObscured xmlns:a14="http://schemas.microsoft.com/office/drawing/2010/main"/>
+                      </a:ext>
+                    </a:extLst>
+                  </pic:spPr>
+                </pic:pic>
+              </a:graphicData>
+            </a:graphic>
+          </wp:inline>
+        </w:drawing>
+      </w:r>
+    </w:p>
+    <w:p>
+      <w:pPr>
+        <w:pStyle w:val="ListParagraph"/>
+        <w:numPr>
+          <w:ilvl w:val="0"/>
+          <w:numId w:val="3"/>
+        </w:numPr>
+        <w:rPr>
+          <w:lang w:val="en-US"/>
+        </w:rPr>
+      </w:pPr>
+      <w:r>
+        <w:rPr>
+          <w:lang w:val="en-US"/>
+        </w:rPr>
+        <w:t xml:space="preserve">Go back to the AWS </w:t>
+      </w:r>
+      <w:r>
+        <w:rPr>
+          <w:lang w:val="en-US"/>
+        </w:rPr>
+        <w:t>external identity provider</w:t>
+      </w:r>
+      <w:r>
+        <w:rPr>
+          <w:lang w:val="en-US"/>
+        </w:rPr>
+        <w:t xml:space="preserve"> page</w:t>
+      </w:r>
+    </w:p>
+    <w:p>
+      <w:pPr>
+        <w:pStyle w:val="ListParagraph"/>
+        <w:numPr>
+          <w:ilvl w:val="0"/>
+          <w:numId w:val="3"/>
+        </w:numPr>
+        <w:rPr>
+          <w:lang w:val="en-US"/>
+        </w:rPr>
+      </w:pPr>
+      <w:r>
+        <w:rPr>
+          <w:lang w:val="en-US"/>
+        </w:rPr>
+        <w:t xml:space="preserve">Look for </w:t>
+      </w:r>
+      <w:r>
+        <w:rPr>
+          <w:b/>
+          <w:bCs/>
+        </w:rPr>
+        <w:t>IdP SAML metadata</w:t>
+      </w:r>
+      <w:r>
+        <w:rPr>
+          <w:b/>
+          <w:bCs/>
+        </w:rPr>
+        <w:t xml:space="preserve"> </w:t>
+      </w:r>
+      <w:r>
+        <w:t>and upload the Federation Metadata XML file there</w:t>
+      </w:r>
+    </w:p>
+    <w:p>
+      <w:pPr>
+        <w:rPr>
+          <w:lang w:val="en-US"/>
+        </w:rPr>
+      </w:pPr>
+      <w:r>
+        <w:rPr>
+          <w:noProof/>
+          <w:lang w:val="en-US"/>
+        </w:rPr>
+        <w:drawing>
+          <wp:inline distT="0" distB="0" distL="0" distR="0" wp14:anchorId="5D97657B" wp14:editId="141CFF38">
+            <wp:extent cx="5731510" cy="1732915"/>
+            <wp:effectExtent l="0" t="0" r="2540" b="635"/>
+            <wp:docPr id="149751115" name="Picture 1"/>
+            <wp:cNvGraphicFramePr>
+              <a:graphicFrameLocks xmlns:a="http://schemas.openxmlformats.org/drawingml/2006/main" noChangeAspect="1"/>
+            </wp:cNvGraphicFramePr>
+            <a:graphic xmlns:a="http://schemas.openxmlformats.org/drawingml/2006/main">
+              <a:graphicData uri="http://schemas.openxmlformats.org/drawingml/2006/picture">
+                <pic:pic xmlns:pic="http://schemas.openxmlformats.org/drawingml/2006/picture">
+                  <pic:nvPicPr>
+                    <pic:cNvPr id="149751115" name=""/>
+                    <pic:cNvPicPr/>
+                  </pic:nvPicPr>
+                  <pic:blipFill>
+                    <a:blip r:embed="rId25"/>
+                    <a:stretch>
+                      <a:fillRect/>
+                    </a:stretch>
+                  </pic:blipFill>
+                  <pic:spPr>
+                    <a:xfrm>
+                      <a:off x="0" y="0"/>
+                      <a:ext cx="5731510" cy="1732915"/>
+                    </a:xfrm>
+                    <a:prstGeom prst="rect">
+                      <a:avLst/>
+                    </a:prstGeom>
+                  </pic:spPr>
+                </pic:pic>
+              </a:graphicData>
+            </a:graphic>
+          </wp:inline>
+        </w:drawing>
+      </w:r>
+    </w:p>
+    <w:p>
+      <w:pPr>
+        <w:rPr>
+          <w:lang w:val="en-US"/>
+        </w:rPr>
+      </w:pPr>
+      <w:r>
+        <w:rPr>
+          <w:noProof/>
+          <w:lang w:val="en-US"/>
+        </w:rPr>
+        <w:drawing>
+          <wp:inline distT="0" distB="0" distL="0" distR="0" wp14:anchorId="3777D186" wp14:editId="0AADD4C7">
+            <wp:extent cx="5731510" cy="1047750"/>
+            <wp:effectExtent l="0" t="0" r="2540" b="0"/>
+            <wp:docPr id="1150849897" name="Picture 1"/>
+            <wp:cNvGraphicFramePr>
+              <a:graphicFrameLocks xmlns:a="http://schemas.openxmlformats.org/drawingml/2006/main" noChangeAspect="1"/>
+            </wp:cNvGraphicFramePr>
+            <a:graphic xmlns:a="http://schemas.openxmlformats.org/drawingml/2006/main">
+              <a:graphicData uri="http://schemas.openxmlformats.org/drawingml/2006/picture">
+                <pic:pic xmlns:pic="http://schemas.openxmlformats.org/drawingml/2006/picture">
+                  <pic:nvPicPr>
+                    <pic:cNvPr id="1150849897" name=""/>
+                    <pic:cNvPicPr/>
+                  </pic:nvPicPr>
+                  <pic:blipFill>
+                    <a:blip r:embed="rId26"/>
+                    <a:stretch>
+                      <a:fillRect/>
+                    </a:stretch>
+                  </pic:blipFill>
+                  <pic:spPr>
+                    <a:xfrm>
+                      <a:off x="0" y="0"/>
+                      <a:ext cx="5731510" cy="1047750"/>
+                    </a:xfrm>
+                    <a:prstGeom prst="rect">
+                      <a:avLst/>
+                    </a:prstGeom>
+                  </pic:spPr>
+                </pic:pic>
+              </a:graphicData>
+            </a:graphic>
+          </wp:inline>
+        </w:drawing>
+      </w:r>
+    </w:p>
+    <w:p>
+      <w:pPr>
+        <w:pStyle w:val="ListParagraph"/>
+        <w:numPr>
+          <w:ilvl w:val="0"/>
+          <w:numId w:val="3"/>
+        </w:numPr>
+        <w:rPr>
+          <w:lang w:val="en-US"/>
+        </w:rPr>
+      </w:pPr>
+      <w:r>
+        <w:rPr>
+          <w:lang w:val="en-US"/>
+        </w:rPr>
+        <w:t>Click the next button to move on to confirming your changes</w:t>
+      </w:r>
+    </w:p>
+    <w:p>
+      <w:pPr>
+        <w:pStyle w:val="ListParagraph"/>
+        <w:numPr>
+          <w:ilvl w:val="0"/>
+          <w:numId w:val="3"/>
+        </w:numPr>
+        <w:rPr>
+          <w:lang w:val="en-US"/>
+        </w:rPr>
+      </w:pPr>
+      <w:r>
+        <w:rPr>
+          <w:lang w:val="en-US"/>
+        </w:rPr>
+        <w:t>Type ACCEPT into the confirmation box at the bottom and then click the “change Identity source" button</w:t>
+      </w:r>
+    </w:p>
+    <w:p>
+      <w:pPr>
+        <w:rPr>
+          <w:lang w:val="en-US"/>
+        </w:rPr>
+      </w:pPr>
+      <w:r>
+        <w:rPr>
+          <w:noProof/>
+          <w:lang w:val="en-US"/>
+        </w:rPr>
+        <w:lastRenderedPageBreak/>
+        <w:drawing>
+          <wp:inline distT="0" distB="0" distL="0" distR="0" wp14:anchorId="49C89AA1" wp14:editId="2FE0DF24">
+            <wp:extent cx="5731510" cy="638810"/>
+            <wp:effectExtent l="0" t="0" r="2540" b="8890"/>
+            <wp:docPr id="370675490" name="Picture 1"/>
+            <wp:cNvGraphicFramePr>
+              <a:graphicFrameLocks xmlns:a="http://schemas.openxmlformats.org/drawingml/2006/main" noChangeAspect="1"/>
+            </wp:cNvGraphicFramePr>
+            <a:graphic xmlns:a="http://schemas.openxmlformats.org/drawingml/2006/main">
+              <a:graphicData uri="http://schemas.openxmlformats.org/drawingml/2006/picture">
+                <pic:pic xmlns:pic="http://schemas.openxmlformats.org/drawingml/2006/picture">
+                  <pic:nvPicPr>
+                    <pic:cNvPr id="370675490" name=""/>
+                    <pic:cNvPicPr/>
+                  </pic:nvPicPr>
+                  <pic:blipFill>
+                    <a:blip r:embed="rId27"/>
+                    <a:stretch>
+                      <a:fillRect/>
+                    </a:stretch>
+                  </pic:blipFill>
+                  <pic:spPr>
+                    <a:xfrm>
+                      <a:off x="0" y="0"/>
+                      <a:ext cx="5731510" cy="638810"/>
+                    </a:xfrm>
+                    <a:prstGeom prst="rect">
+                      <a:avLst/>
+                    </a:prstGeom>
+                  </pic:spPr>
+                </pic:pic>
+              </a:graphicData>
+            </a:graphic>
+          </wp:inline>
+        </w:drawing>
+      </w:r>
+    </w:p>
+    <w:p>
+      <w:pPr>
+        <w:rPr>
+          <w:lang w:val="en-US"/>
+        </w:rPr>
+      </w:pPr>
+      <w:r>
+        <w:rPr>
+          <w:lang w:val="en-US"/>
+        </w:rPr>
+        <w:t>Manual step for AWS SSO for Entra is not complete</w:t>
+      </w:r>
+      <w:r>
+        <w:rPr>
+          <w:lang w:val="en-US"/>
+        </w:rPr>
+        <w:t xml:space="preserve"> Now run C21 to finish SSO Corp setup</w:t>
+      </w:r>
     </w:p>
     <w:sectPr>
       <w:pgSz w:w="11906" w:h="16838"/>

</xml_diff>

<commit_message>
docs: add README with step-by-step instructions for AWS account setup
</commit_message>
<xml_diff>
--- a/Documentation/How to create a Free AWS account.docx
+++ b/Documentation/How to create a Free AWS account.docx
@@ -1275,7 +1275,11 @@
     </w:p>
     <w:p>
       <w:pPr>
-        <w:pStyle w:val="Title"/>
+        <w:pStyle w:val="ListParagraph"/>
+        <w:numPr>
+          <w:ilvl w:val="0"/>
+          <w:numId w:val="2"/>
+        </w:numPr>
         <w:rPr>
           <w:lang w:val="en-US"/>
         </w:rPr>
@@ -1284,22 +1288,15 @@
         <w:rPr>
           <w:lang w:val="en-US"/>
         </w:rPr>
-        <w:t>How to create working Identity source in AWS</w:t>
+        <w:t>Save the top URL that you are logged in with so you can access the login page later.</w:t>
       </w:r>
     </w:p>
     <w:p>
       <w:pPr>
-        <w:rPr>
-          <w:lang w:val="en-US"/>
-        </w:rPr>
-      </w:pPr>
-    </w:p>
-    <w:p>
-      <w:pPr>
         <w:pStyle w:val="ListParagraph"/>
         <w:numPr>
           <w:ilvl w:val="0"/>
-          <w:numId w:val="3"/>
+          <w:numId w:val="2"/>
         </w:numPr>
         <w:rPr>
           <w:lang w:val="en-US"/>
@@ -1309,1142 +1306,7 @@
         <w:rPr>
           <w:lang w:val="en-US"/>
         </w:rPr>
-        <w:t>Navigate to IAM identity center</w:t>
-      </w:r>
-    </w:p>
-    <w:p>
-      <w:pPr>
-        <w:ind w:left="360"/>
-        <w:rPr>
-          <w:lang w:val="en-US"/>
-        </w:rPr>
-      </w:pPr>
-      <w:r>
-        <w:rPr>
-          <w:noProof/>
-          <w:lang w:val="en-US"/>
-        </w:rPr>
-        <w:lastRenderedPageBreak/>
-        <w:drawing>
-          <wp:inline distT="0" distB="0" distL="0" distR="0" wp14:anchorId="437628AD" wp14:editId="270353DC">
-            <wp:extent cx="5731510" cy="2760345"/>
-            <wp:effectExtent l="0" t="0" r="2540" b="1905"/>
-            <wp:docPr id="1083838811" name="Picture 1"/>
-            <wp:cNvGraphicFramePr>
-              <a:graphicFrameLocks xmlns:a="http://schemas.openxmlformats.org/drawingml/2006/main" noChangeAspect="1"/>
-            </wp:cNvGraphicFramePr>
-            <a:graphic xmlns:a="http://schemas.openxmlformats.org/drawingml/2006/main">
-              <a:graphicData uri="http://schemas.openxmlformats.org/drawingml/2006/picture">
-                <pic:pic xmlns:pic="http://schemas.openxmlformats.org/drawingml/2006/picture">
-                  <pic:nvPicPr>
-                    <pic:cNvPr id="1083838811" name=""/>
-                    <pic:cNvPicPr/>
-                  </pic:nvPicPr>
-                  <pic:blipFill>
-                    <a:blip r:embed="rId13"/>
-                    <a:stretch>
-                      <a:fillRect/>
-                    </a:stretch>
-                  </pic:blipFill>
-                  <pic:spPr>
-                    <a:xfrm>
-                      <a:off x="0" y="0"/>
-                      <a:ext cx="5731510" cy="2760345"/>
-                    </a:xfrm>
-                    <a:prstGeom prst="rect">
-                      <a:avLst/>
-                    </a:prstGeom>
-                  </pic:spPr>
-                </pic:pic>
-              </a:graphicData>
-            </a:graphic>
-          </wp:inline>
-        </w:drawing>
-      </w:r>
-    </w:p>
-    <w:p>
-      <w:pPr>
-        <w:pStyle w:val="ListParagraph"/>
-        <w:numPr>
-          <w:ilvl w:val="0"/>
-          <w:numId w:val="3"/>
-        </w:numPr>
-        <w:rPr>
-          <w:lang w:val="en-US"/>
-        </w:rPr>
-      </w:pPr>
-      <w:r>
-        <w:rPr>
-          <w:lang w:val="en-US"/>
-        </w:rPr>
-        <w:t>Click the “enable” button on the side of the screen to enable the identity centre</w:t>
-      </w:r>
-    </w:p>
-    <w:p>
-      <w:pPr>
-        <w:ind w:left="360"/>
-        <w:rPr>
-          <w:lang w:val="en-US"/>
-        </w:rPr>
-      </w:pPr>
-    </w:p>
-    <w:p>
-      <w:pPr>
-        <w:ind w:left="360"/>
-        <w:rPr>
-          <w:lang w:val="en-US"/>
-        </w:rPr>
-      </w:pPr>
-      <w:r>
-        <w:rPr>
-          <w:noProof/>
-          <w:lang w:val="en-US"/>
-        </w:rPr>
-        <w:drawing>
-          <wp:inline distT="0" distB="0" distL="0" distR="0" wp14:anchorId="45B4DEB0" wp14:editId="46CFCF84">
-            <wp:extent cx="5731510" cy="3653155"/>
-            <wp:effectExtent l="0" t="0" r="2540" b="4445"/>
-            <wp:docPr id="271272927" name="Picture 1"/>
-            <wp:cNvGraphicFramePr>
-              <a:graphicFrameLocks xmlns:a="http://schemas.openxmlformats.org/drawingml/2006/main" noChangeAspect="1"/>
-            </wp:cNvGraphicFramePr>
-            <a:graphic xmlns:a="http://schemas.openxmlformats.org/drawingml/2006/main">
-              <a:graphicData uri="http://schemas.openxmlformats.org/drawingml/2006/picture">
-                <pic:pic xmlns:pic="http://schemas.openxmlformats.org/drawingml/2006/picture">
-                  <pic:nvPicPr>
-                    <pic:cNvPr id="271272927" name=""/>
-                    <pic:cNvPicPr/>
-                  </pic:nvPicPr>
-                  <pic:blipFill>
-                    <a:blip r:embed="rId14"/>
-                    <a:stretch>
-                      <a:fillRect/>
-                    </a:stretch>
-                  </pic:blipFill>
-                  <pic:spPr>
-                    <a:xfrm>
-                      <a:off x="0" y="0"/>
-                      <a:ext cx="5731510" cy="3653155"/>
-                    </a:xfrm>
-                    <a:prstGeom prst="rect">
-                      <a:avLst/>
-                    </a:prstGeom>
-                  </pic:spPr>
-                </pic:pic>
-              </a:graphicData>
-            </a:graphic>
-          </wp:inline>
-        </w:drawing>
-      </w:r>
-    </w:p>
-    <w:p>
-      <w:pPr>
-        <w:pStyle w:val="ListParagraph"/>
-        <w:numPr>
-          <w:ilvl w:val="0"/>
-          <w:numId w:val="3"/>
-        </w:numPr>
-        <w:rPr>
-          <w:lang w:val="en-US"/>
-        </w:rPr>
-      </w:pPr>
-      <w:r>
-        <w:rPr>
-          <w:lang w:val="en-US"/>
-        </w:rPr>
-        <w:t>Click “enable” again on the confirmation screen</w:t>
-      </w:r>
-    </w:p>
-    <w:p>
-      <w:pPr>
-        <w:pStyle w:val="ListParagraph"/>
-        <w:numPr>
-          <w:ilvl w:val="0"/>
-          <w:numId w:val="3"/>
-        </w:numPr>
-        <w:rPr>
-          <w:lang w:val="en-US"/>
-        </w:rPr>
-      </w:pPr>
-      <w:r>
-        <w:rPr>
-          <w:lang w:val="en-US"/>
-        </w:rPr>
-        <w:t>On the dashboard click on the “go to settings” button</w:t>
-      </w:r>
-    </w:p>
-    <w:p>
-      <w:pPr>
-        <w:rPr>
-          <w:lang w:val="en-US"/>
-        </w:rPr>
-      </w:pPr>
-      <w:r>
-        <w:rPr>
-          <w:noProof/>
-          <w:lang w:val="en-US"/>
-        </w:rPr>
-        <w:lastRenderedPageBreak/>
-        <w:drawing>
-          <wp:inline distT="0" distB="0" distL="0" distR="0" wp14:anchorId="2D58E308" wp14:editId="460A68D9">
-            <wp:extent cx="5731510" cy="1284605"/>
-            <wp:effectExtent l="0" t="0" r="2540" b="0"/>
-            <wp:docPr id="534442743" name="Picture 1"/>
-            <wp:cNvGraphicFramePr>
-              <a:graphicFrameLocks xmlns:a="http://schemas.openxmlformats.org/drawingml/2006/main" noChangeAspect="1"/>
-            </wp:cNvGraphicFramePr>
-            <a:graphic xmlns:a="http://schemas.openxmlformats.org/drawingml/2006/main">
-              <a:graphicData uri="http://schemas.openxmlformats.org/drawingml/2006/picture">
-                <pic:pic xmlns:pic="http://schemas.openxmlformats.org/drawingml/2006/picture">
-                  <pic:nvPicPr>
-                    <pic:cNvPr id="534442743" name=""/>
-                    <pic:cNvPicPr/>
-                  </pic:nvPicPr>
-                  <pic:blipFill>
-                    <a:blip r:embed="rId15"/>
-                    <a:stretch>
-                      <a:fillRect/>
-                    </a:stretch>
-                  </pic:blipFill>
-                  <pic:spPr>
-                    <a:xfrm>
-                      <a:off x="0" y="0"/>
-                      <a:ext cx="5731510" cy="1284605"/>
-                    </a:xfrm>
-                    <a:prstGeom prst="rect">
-                      <a:avLst/>
-                    </a:prstGeom>
-                  </pic:spPr>
-                </pic:pic>
-              </a:graphicData>
-            </a:graphic>
-          </wp:inline>
-        </w:drawing>
-      </w:r>
-    </w:p>
-    <w:p>
-      <w:pPr>
-        <w:pStyle w:val="ListParagraph"/>
-        <w:numPr>
-          <w:ilvl w:val="0"/>
-          <w:numId w:val="3"/>
-        </w:numPr>
-        <w:rPr>
-          <w:lang w:val="en-US"/>
-        </w:rPr>
-      </w:pPr>
-      <w:r>
-        <w:rPr>
-          <w:lang w:val="en-US"/>
-        </w:rPr>
-        <w:t>Scroll down to Identity source and then click on Actions and then click “change Identity source”</w:t>
-      </w:r>
-    </w:p>
-    <w:p>
-      <w:pPr>
-        <w:rPr>
-          <w:lang w:val="en-US"/>
-        </w:rPr>
-      </w:pPr>
-      <w:r>
-        <w:rPr>
-          <w:noProof/>
-          <w:lang w:val="en-US"/>
-        </w:rPr>
-        <w:drawing>
-          <wp:inline distT="0" distB="0" distL="0" distR="0" wp14:anchorId="1865167D" wp14:editId="791C8216">
-            <wp:extent cx="5731510" cy="1691005"/>
-            <wp:effectExtent l="0" t="0" r="2540" b="4445"/>
-            <wp:docPr id="1228420389" name="Picture 1"/>
-            <wp:cNvGraphicFramePr>
-              <a:graphicFrameLocks xmlns:a="http://schemas.openxmlformats.org/drawingml/2006/main" noChangeAspect="1"/>
-            </wp:cNvGraphicFramePr>
-            <a:graphic xmlns:a="http://schemas.openxmlformats.org/drawingml/2006/main">
-              <a:graphicData uri="http://schemas.openxmlformats.org/drawingml/2006/picture">
-                <pic:pic xmlns:pic="http://schemas.openxmlformats.org/drawingml/2006/picture">
-                  <pic:nvPicPr>
-                    <pic:cNvPr id="1228420389" name=""/>
-                    <pic:cNvPicPr/>
-                  </pic:nvPicPr>
-                  <pic:blipFill>
-                    <a:blip r:embed="rId16"/>
-                    <a:stretch>
-                      <a:fillRect/>
-                    </a:stretch>
-                  </pic:blipFill>
-                  <pic:spPr>
-                    <a:xfrm>
-                      <a:off x="0" y="0"/>
-                      <a:ext cx="5731510" cy="1691005"/>
-                    </a:xfrm>
-                    <a:prstGeom prst="rect">
-                      <a:avLst/>
-                    </a:prstGeom>
-                  </pic:spPr>
-                </pic:pic>
-              </a:graphicData>
-            </a:graphic>
-          </wp:inline>
-        </w:drawing>
-      </w:r>
-    </w:p>
-    <w:p>
-      <w:pPr>
-        <w:pStyle w:val="ListParagraph"/>
-        <w:numPr>
-          <w:ilvl w:val="0"/>
-          <w:numId w:val="3"/>
-        </w:numPr>
-        <w:rPr>
-          <w:lang w:val="en-US"/>
-        </w:rPr>
-      </w:pPr>
-      <w:r>
-        <w:rPr>
-          <w:lang w:val="en-US"/>
-        </w:rPr>
-        <w:t>Select External identity provider and then click next.</w:t>
-      </w:r>
-    </w:p>
-    <w:p>
-      <w:pPr>
-        <w:rPr>
-          <w:lang w:val="en-US"/>
-        </w:rPr>
-      </w:pPr>
-      <w:r>
-        <w:rPr>
-          <w:noProof/>
-          <w:lang w:val="en-US"/>
-        </w:rPr>
-        <w:drawing>
-          <wp:inline distT="0" distB="0" distL="0" distR="0" wp14:anchorId="55B78D89" wp14:editId="7DBDB13C">
-            <wp:extent cx="5731510" cy="1657350"/>
-            <wp:effectExtent l="0" t="0" r="2540" b="0"/>
-            <wp:docPr id="1470109259" name="Picture 1"/>
-            <wp:cNvGraphicFramePr>
-              <a:graphicFrameLocks xmlns:a="http://schemas.openxmlformats.org/drawingml/2006/main" noChangeAspect="1"/>
-            </wp:cNvGraphicFramePr>
-            <a:graphic xmlns:a="http://schemas.openxmlformats.org/drawingml/2006/main">
-              <a:graphicData uri="http://schemas.openxmlformats.org/drawingml/2006/picture">
-                <pic:pic xmlns:pic="http://schemas.openxmlformats.org/drawingml/2006/picture">
-                  <pic:nvPicPr>
-                    <pic:cNvPr id="1470109259" name=""/>
-                    <pic:cNvPicPr/>
-                  </pic:nvPicPr>
-                  <pic:blipFill>
-                    <a:blip r:embed="rId17"/>
-                    <a:stretch>
-                      <a:fillRect/>
-                    </a:stretch>
-                  </pic:blipFill>
-                  <pic:spPr>
-                    <a:xfrm>
-                      <a:off x="0" y="0"/>
-                      <a:ext cx="5731510" cy="1657350"/>
-                    </a:xfrm>
-                    <a:prstGeom prst="rect">
-                      <a:avLst/>
-                    </a:prstGeom>
-                  </pic:spPr>
-                </pic:pic>
-              </a:graphicData>
-            </a:graphic>
-          </wp:inline>
-        </w:drawing>
-      </w:r>
-    </w:p>
-    <w:p>
-      <w:pPr>
-        <w:pStyle w:val="ListParagraph"/>
-        <w:numPr>
-          <w:ilvl w:val="0"/>
-          <w:numId w:val="3"/>
-        </w:numPr>
-        <w:rPr>
-          <w:lang w:val="en-US"/>
-        </w:rPr>
-      </w:pPr>
-      <w:r>
-        <w:rPr>
-          <w:lang w:val="en-US"/>
-        </w:rPr>
-        <w:t>Once on the Configure external identity provider page select “Dual-stack”</w:t>
-      </w:r>
-    </w:p>
-    <w:p>
-      <w:pPr>
-        <w:rPr>
-          <w:lang w:val="en-US"/>
-        </w:rPr>
-      </w:pPr>
-      <w:r>
-        <w:rPr>
-          <w:noProof/>
-          <w:lang w:val="en-US"/>
-        </w:rPr>
-        <w:drawing>
-          <wp:inline distT="0" distB="0" distL="0" distR="0" wp14:anchorId="71453D49" wp14:editId="084D0858">
-            <wp:extent cx="5731510" cy="1034415"/>
-            <wp:effectExtent l="0" t="0" r="2540" b="0"/>
-            <wp:docPr id="826964576" name="Picture 1"/>
-            <wp:cNvGraphicFramePr>
-              <a:graphicFrameLocks xmlns:a="http://schemas.openxmlformats.org/drawingml/2006/main" noChangeAspect="1"/>
-            </wp:cNvGraphicFramePr>
-            <a:graphic xmlns:a="http://schemas.openxmlformats.org/drawingml/2006/main">
-              <a:graphicData uri="http://schemas.openxmlformats.org/drawingml/2006/picture">
-                <pic:pic xmlns:pic="http://schemas.openxmlformats.org/drawingml/2006/picture">
-                  <pic:nvPicPr>
-                    <pic:cNvPr id="826964576" name=""/>
-                    <pic:cNvPicPr/>
-                  </pic:nvPicPr>
-                  <pic:blipFill>
-                    <a:blip r:embed="rId18"/>
-                    <a:stretch>
-                      <a:fillRect/>
-                    </a:stretch>
-                  </pic:blipFill>
-                  <pic:spPr>
-                    <a:xfrm>
-                      <a:off x="0" y="0"/>
-                      <a:ext cx="5731510" cy="1034415"/>
-                    </a:xfrm>
-                    <a:prstGeom prst="rect">
-                      <a:avLst/>
-                    </a:prstGeom>
-                  </pic:spPr>
-                </pic:pic>
-              </a:graphicData>
-            </a:graphic>
-          </wp:inline>
-        </w:drawing>
-      </w:r>
-    </w:p>
-    <w:p>
-      <w:pPr>
-        <w:pStyle w:val="ListParagraph"/>
-        <w:numPr>
-          <w:ilvl w:val="0"/>
-          <w:numId w:val="3"/>
-        </w:numPr>
-        <w:rPr>
-          <w:lang w:val="en-US"/>
-        </w:rPr>
-      </w:pPr>
-      <w:r>
-        <w:rPr>
-          <w:lang w:val="en-US"/>
-        </w:rPr>
-        <w:t>Click on the Download metadata file</w:t>
-      </w:r>
-    </w:p>
-    <w:p>
-      <w:pPr>
-        <w:rPr>
-          <w:lang w:val="en-US"/>
-        </w:rPr>
-      </w:pPr>
-      <w:r>
-        <w:rPr>
-          <w:noProof/>
-          <w:lang w:val="en-US"/>
-        </w:rPr>
-        <w:lastRenderedPageBreak/>
-        <w:drawing>
-          <wp:inline distT="0" distB="0" distL="0" distR="0" wp14:anchorId="0E45BDF6" wp14:editId="24953D5E">
-            <wp:extent cx="5731510" cy="1783080"/>
-            <wp:effectExtent l="0" t="0" r="2540" b="7620"/>
-            <wp:docPr id="193081436" name="Picture 1"/>
-            <wp:cNvGraphicFramePr>
-              <a:graphicFrameLocks xmlns:a="http://schemas.openxmlformats.org/drawingml/2006/main" noChangeAspect="1"/>
-            </wp:cNvGraphicFramePr>
-            <a:graphic xmlns:a="http://schemas.openxmlformats.org/drawingml/2006/main">
-              <a:graphicData uri="http://schemas.openxmlformats.org/drawingml/2006/picture">
-                <pic:pic xmlns:pic="http://schemas.openxmlformats.org/drawingml/2006/picture">
-                  <pic:nvPicPr>
-                    <pic:cNvPr id="193081436" name=""/>
-                    <pic:cNvPicPr/>
-                  </pic:nvPicPr>
-                  <pic:blipFill>
-                    <a:blip r:embed="rId19"/>
-                    <a:stretch>
-                      <a:fillRect/>
-                    </a:stretch>
-                  </pic:blipFill>
-                  <pic:spPr>
-                    <a:xfrm>
-                      <a:off x="0" y="0"/>
-                      <a:ext cx="5731510" cy="1783080"/>
-                    </a:xfrm>
-                    <a:prstGeom prst="rect">
-                      <a:avLst/>
-                    </a:prstGeom>
-                  </pic:spPr>
-                </pic:pic>
-              </a:graphicData>
-            </a:graphic>
-          </wp:inline>
-        </w:drawing>
-      </w:r>
-    </w:p>
-    <w:p>
-      <w:pPr>
-        <w:pStyle w:val="ListParagraph"/>
-        <w:numPr>
-          <w:ilvl w:val="0"/>
-          <w:numId w:val="3"/>
-        </w:numPr>
-        <w:rPr>
-          <w:lang w:val="en-US"/>
-        </w:rPr>
-      </w:pPr>
-      <w:r>
-        <w:rPr>
-          <w:lang w:val="en-US"/>
-        </w:rPr>
-        <w:t>Then you must navigate to Azure Entra and go to your enterprise applications</w:t>
-      </w:r>
-    </w:p>
-    <w:p>
-      <w:pPr>
-        <w:rPr>
-          <w:lang w:val="en-US"/>
-        </w:rPr>
-      </w:pPr>
-      <w:r>
-        <w:rPr>
-          <w:noProof/>
-          <w:lang w:val="en-US"/>
-        </w:rPr>
-        <w:drawing>
-          <wp:inline distT="0" distB="0" distL="0" distR="0" wp14:anchorId="0C5FFF11" wp14:editId="59C8E054">
-            <wp:extent cx="2486372" cy="3086531"/>
-            <wp:effectExtent l="0" t="0" r="9525" b="0"/>
-            <wp:docPr id="2115718579" name="Picture 1"/>
-            <wp:cNvGraphicFramePr>
-              <a:graphicFrameLocks xmlns:a="http://schemas.openxmlformats.org/drawingml/2006/main" noChangeAspect="1"/>
-            </wp:cNvGraphicFramePr>
-            <a:graphic xmlns:a="http://schemas.openxmlformats.org/drawingml/2006/main">
-              <a:graphicData uri="http://schemas.openxmlformats.org/drawingml/2006/picture">
-                <pic:pic xmlns:pic="http://schemas.openxmlformats.org/drawingml/2006/picture">
-                  <pic:nvPicPr>
-                    <pic:cNvPr id="2115718579" name=""/>
-                    <pic:cNvPicPr/>
-                  </pic:nvPicPr>
-                  <pic:blipFill>
-                    <a:blip r:embed="rId20"/>
-                    <a:stretch>
-                      <a:fillRect/>
-                    </a:stretch>
-                  </pic:blipFill>
-                  <pic:spPr>
-                    <a:xfrm>
-                      <a:off x="0" y="0"/>
-                      <a:ext cx="2486372" cy="3086531"/>
-                    </a:xfrm>
-                    <a:prstGeom prst="rect">
-                      <a:avLst/>
-                    </a:prstGeom>
-                  </pic:spPr>
-                </pic:pic>
-              </a:graphicData>
-            </a:graphic>
-          </wp:inline>
-        </w:drawing>
-      </w:r>
-    </w:p>
-    <w:p>
-      <w:pPr>
-        <w:pStyle w:val="ListParagraph"/>
-        <w:numPr>
-          <w:ilvl w:val="0"/>
-          <w:numId w:val="3"/>
-        </w:numPr>
-        <w:rPr>
-          <w:lang w:val="en-US"/>
-        </w:rPr>
-      </w:pPr>
-      <w:r>
-        <w:rPr>
-          <w:lang w:val="en-US"/>
-        </w:rPr>
-        <w:t>Find the SSO application that was created by c20 (AWS SSO Corp)</w:t>
-      </w:r>
-    </w:p>
-    <w:p>
-      <w:pPr>
-        <w:pStyle w:val="ListParagraph"/>
-        <w:numPr>
-          <w:ilvl w:val="0"/>
-          <w:numId w:val="3"/>
-        </w:numPr>
-        <w:rPr>
-          <w:lang w:val="en-US"/>
-        </w:rPr>
-      </w:pPr>
-      <w:r>
-        <w:rPr>
-          <w:lang w:val="en-US"/>
-        </w:rPr>
-        <w:t>Navigate to single sign-on</w:t>
-      </w:r>
-    </w:p>
-    <w:p>
-      <w:pPr>
-        <w:rPr>
-          <w:lang w:val="en-US"/>
-        </w:rPr>
-      </w:pPr>
-      <w:r>
-        <w:rPr>
-          <w:noProof/>
-          <w:lang w:val="en-US"/>
-        </w:rPr>
-        <w:lastRenderedPageBreak/>
-        <w:drawing>
-          <wp:inline distT="0" distB="0" distL="0" distR="0" wp14:anchorId="0A52D65A" wp14:editId="26F5FA63">
-            <wp:extent cx="2429214" cy="5153744"/>
-            <wp:effectExtent l="0" t="0" r="9525" b="8890"/>
-            <wp:docPr id="322285919" name="Picture 1"/>
-            <wp:cNvGraphicFramePr>
-              <a:graphicFrameLocks xmlns:a="http://schemas.openxmlformats.org/drawingml/2006/main" noChangeAspect="1"/>
-            </wp:cNvGraphicFramePr>
-            <a:graphic xmlns:a="http://schemas.openxmlformats.org/drawingml/2006/main">
-              <a:graphicData uri="http://schemas.openxmlformats.org/drawingml/2006/picture">
-                <pic:pic xmlns:pic="http://schemas.openxmlformats.org/drawingml/2006/picture">
-                  <pic:nvPicPr>
-                    <pic:cNvPr id="322285919" name=""/>
-                    <pic:cNvPicPr/>
-                  </pic:nvPicPr>
-                  <pic:blipFill>
-                    <a:blip r:embed="rId21"/>
-                    <a:stretch>
-                      <a:fillRect/>
-                    </a:stretch>
-                  </pic:blipFill>
-                  <pic:spPr>
-                    <a:xfrm>
-                      <a:off x="0" y="0"/>
-                      <a:ext cx="2429214" cy="5153744"/>
-                    </a:xfrm>
-                    <a:prstGeom prst="rect">
-                      <a:avLst/>
-                    </a:prstGeom>
-                  </pic:spPr>
-                </pic:pic>
-              </a:graphicData>
-            </a:graphic>
-          </wp:inline>
-        </w:drawing>
-      </w:r>
-    </w:p>
-    <w:p>
-      <w:pPr>
-        <w:pStyle w:val="ListParagraph"/>
-        <w:numPr>
-          <w:ilvl w:val="0"/>
-          <w:numId w:val="3"/>
-        </w:numPr>
-        <w:rPr>
-          <w:lang w:val="en-US"/>
-        </w:rPr>
-      </w:pPr>
-      <w:r>
-        <w:rPr>
-          <w:lang w:val="en-US"/>
-        </w:rPr>
-        <w:t>Choose SAML</w:t>
-      </w:r>
-    </w:p>
-    <w:p>
-      <w:pPr>
-        <w:rPr>
-          <w:lang w:val="en-US"/>
-        </w:rPr>
-      </w:pPr>
-      <w:r>
-        <w:rPr>
-          <w:noProof/>
-          <w:lang w:val="en-US"/>
-        </w:rPr>
-        <w:drawing>
-          <wp:inline distT="0" distB="0" distL="0" distR="0" wp14:anchorId="45936A93" wp14:editId="436C7599">
-            <wp:extent cx="5731510" cy="1936115"/>
-            <wp:effectExtent l="0" t="0" r="2540" b="6985"/>
-            <wp:docPr id="361738957" name="Picture 1"/>
-            <wp:cNvGraphicFramePr>
-              <a:graphicFrameLocks xmlns:a="http://schemas.openxmlformats.org/drawingml/2006/main" noChangeAspect="1"/>
-            </wp:cNvGraphicFramePr>
-            <a:graphic xmlns:a="http://schemas.openxmlformats.org/drawingml/2006/main">
-              <a:graphicData uri="http://schemas.openxmlformats.org/drawingml/2006/picture">
-                <pic:pic xmlns:pic="http://schemas.openxmlformats.org/drawingml/2006/picture">
-                  <pic:nvPicPr>
-                    <pic:cNvPr id="361738957" name=""/>
-                    <pic:cNvPicPr/>
-                  </pic:nvPicPr>
-                  <pic:blipFill>
-                    <a:blip r:embed="rId22"/>
-                    <a:stretch>
-                      <a:fillRect/>
-                    </a:stretch>
-                  </pic:blipFill>
-                  <pic:spPr>
-                    <a:xfrm>
-                      <a:off x="0" y="0"/>
-                      <a:ext cx="5731510" cy="1936115"/>
-                    </a:xfrm>
-                    <a:prstGeom prst="rect">
-                      <a:avLst/>
-                    </a:prstGeom>
-                  </pic:spPr>
-                </pic:pic>
-              </a:graphicData>
-            </a:graphic>
-          </wp:inline>
-        </w:drawing>
-      </w:r>
-    </w:p>
-    <w:p>
-      <w:pPr>
-        <w:pStyle w:val="ListParagraph"/>
-        <w:numPr>
-          <w:ilvl w:val="0"/>
-          <w:numId w:val="3"/>
-        </w:numPr>
-        <w:rPr>
-          <w:lang w:val="en-US"/>
-        </w:rPr>
-      </w:pPr>
-      <w:r>
-        <w:rPr>
-          <w:lang w:val="en-US"/>
-        </w:rPr>
-        <w:t>Click the “upload media file button” (IMPORTANT: make sure you have the required role to edit the enterprise application file like “Global Administrator”)</w:t>
-      </w:r>
-    </w:p>
-    <w:p>
-      <w:pPr>
-        <w:pStyle w:val="ListParagraph"/>
-        <w:numPr>
-          <w:ilvl w:val="0"/>
-          <w:numId w:val="3"/>
-        </w:numPr>
-        <w:rPr>
-          <w:lang w:val="en-US"/>
-        </w:rPr>
-      </w:pPr>
-      <w:r>
-        <w:rPr>
-          <w:lang w:val="en-US"/>
-        </w:rPr>
-        <w:t>Upload the metadata file you downloaded from IAM identity provider</w:t>
-      </w:r>
-    </w:p>
-    <w:p>
-      <w:pPr>
-        <w:pStyle w:val="ListParagraph"/>
-        <w:numPr>
-          <w:ilvl w:val="0"/>
-          <w:numId w:val="3"/>
-        </w:numPr>
-        <w:rPr>
-          <w:lang w:val="en-US"/>
-        </w:rPr>
-      </w:pPr>
-      <w:r>
-        <w:rPr>
-          <w:lang w:val="en-US"/>
-        </w:rPr>
-        <w:t>Click the save button</w:t>
-      </w:r>
-    </w:p>
-    <w:p>
-      <w:pPr>
-        <w:rPr>
-          <w:lang w:val="en-US"/>
-        </w:rPr>
-      </w:pPr>
-      <w:r>
-        <w:rPr>
-          <w:noProof/>
-          <w:lang w:val="en-US"/>
-        </w:rPr>
-        <w:lastRenderedPageBreak/>
-        <w:drawing>
-          <wp:inline distT="0" distB="0" distL="0" distR="0" wp14:anchorId="32E85383" wp14:editId="15D895C5">
-            <wp:extent cx="5731510" cy="1574800"/>
-            <wp:effectExtent l="0" t="0" r="2540" b="6350"/>
-            <wp:docPr id="1561802242" name="Picture 1"/>
-            <wp:cNvGraphicFramePr>
-              <a:graphicFrameLocks xmlns:a="http://schemas.openxmlformats.org/drawingml/2006/main" noChangeAspect="1"/>
-            </wp:cNvGraphicFramePr>
-            <a:graphic xmlns:a="http://schemas.openxmlformats.org/drawingml/2006/main">
-              <a:graphicData uri="http://schemas.openxmlformats.org/drawingml/2006/picture">
-                <pic:pic xmlns:pic="http://schemas.openxmlformats.org/drawingml/2006/picture">
-                  <pic:nvPicPr>
-                    <pic:cNvPr id="1561802242" name=""/>
-                    <pic:cNvPicPr/>
-                  </pic:nvPicPr>
-                  <pic:blipFill>
-                    <a:blip r:embed="rId23"/>
-                    <a:stretch>
-                      <a:fillRect/>
-                    </a:stretch>
-                  </pic:blipFill>
-                  <pic:spPr>
-                    <a:xfrm>
-                      <a:off x="0" y="0"/>
-                      <a:ext cx="5731510" cy="1574800"/>
-                    </a:xfrm>
-                    <a:prstGeom prst="rect">
-                      <a:avLst/>
-                    </a:prstGeom>
-                  </pic:spPr>
-                </pic:pic>
-              </a:graphicData>
-            </a:graphic>
-          </wp:inline>
-        </w:drawing>
-      </w:r>
-    </w:p>
-    <w:p>
-      <w:pPr>
-        <w:pStyle w:val="ListParagraph"/>
-        <w:numPr>
-          <w:ilvl w:val="0"/>
-          <w:numId w:val="3"/>
-        </w:numPr>
-        <w:rPr>
-          <w:lang w:val="en-US"/>
-        </w:rPr>
-      </w:pPr>
-      <w:r>
-        <w:rPr>
-          <w:lang w:val="en-US"/>
-        </w:rPr>
-        <w:t>Scroll down to SAML Certificates and download the federation Metadata XML</w:t>
-      </w:r>
-    </w:p>
-    <w:p>
-      <w:pPr>
-        <w:rPr>
-          <w:lang w:val="en-US"/>
-        </w:rPr>
-      </w:pPr>
-      <w:r>
-        <w:rPr>
-          <w:noProof/>
-          <w:lang w:val="en-US"/>
-        </w:rPr>
-        <w:drawing>
-          <wp:inline distT="0" distB="0" distL="0" distR="0" wp14:anchorId="30F65D7D" wp14:editId="766D63B7">
-            <wp:extent cx="5731510" cy="2066925"/>
-            <wp:effectExtent l="0" t="0" r="2540" b="9525"/>
-            <wp:docPr id="285286611" name="Picture 1"/>
-            <wp:cNvGraphicFramePr>
-              <a:graphicFrameLocks xmlns:a="http://schemas.openxmlformats.org/drawingml/2006/main" noChangeAspect="1"/>
-            </wp:cNvGraphicFramePr>
-            <a:graphic xmlns:a="http://schemas.openxmlformats.org/drawingml/2006/main">
-              <a:graphicData uri="http://schemas.openxmlformats.org/drawingml/2006/picture">
-                <pic:pic xmlns:pic="http://schemas.openxmlformats.org/drawingml/2006/picture">
-                  <pic:nvPicPr>
-                    <pic:cNvPr id="285286611" name=""/>
-                    <pic:cNvPicPr/>
-                  </pic:nvPicPr>
-                  <pic:blipFill rotWithShape="1">
-                    <a:blip r:embed="rId24"/>
-                    <a:srcRect b="27666"/>
-                    <a:stretch>
-                      <a:fillRect/>
-                    </a:stretch>
-                  </pic:blipFill>
-                  <pic:spPr bwMode="auto">
-                    <a:xfrm>
-                      <a:off x="0" y="0"/>
-                      <a:ext cx="5731510" cy="2066925"/>
-                    </a:xfrm>
-                    <a:prstGeom prst="rect">
-                      <a:avLst/>
-                    </a:prstGeom>
-                    <a:ln>
-                      <a:noFill/>
-                    </a:ln>
-                    <a:extLst>
-                      <a:ext uri="{53640926-AAD7-44D8-BBD7-CCE9431645EC}">
-                        <a14:shadowObscured xmlns:a14="http://schemas.microsoft.com/office/drawing/2010/main"/>
-                      </a:ext>
-                    </a:extLst>
-                  </pic:spPr>
-                </pic:pic>
-              </a:graphicData>
-            </a:graphic>
-          </wp:inline>
-        </w:drawing>
-      </w:r>
-    </w:p>
-    <w:p>
-      <w:pPr>
-        <w:pStyle w:val="ListParagraph"/>
-        <w:numPr>
-          <w:ilvl w:val="0"/>
-          <w:numId w:val="3"/>
-        </w:numPr>
-        <w:rPr>
-          <w:lang w:val="en-US"/>
-        </w:rPr>
-      </w:pPr>
-      <w:r>
-        <w:rPr>
-          <w:lang w:val="en-US"/>
-        </w:rPr>
-        <w:t xml:space="preserve">Go back to the AWS </w:t>
-      </w:r>
-      <w:r>
-        <w:rPr>
-          <w:lang w:val="en-US"/>
-        </w:rPr>
-        <w:t>external identity provider</w:t>
-      </w:r>
-      <w:r>
-        <w:rPr>
-          <w:lang w:val="en-US"/>
-        </w:rPr>
-        <w:t xml:space="preserve"> page</w:t>
-      </w:r>
-    </w:p>
-    <w:p>
-      <w:pPr>
-        <w:pStyle w:val="ListParagraph"/>
-        <w:numPr>
-          <w:ilvl w:val="0"/>
-          <w:numId w:val="3"/>
-        </w:numPr>
-        <w:rPr>
-          <w:lang w:val="en-US"/>
-        </w:rPr>
-      </w:pPr>
-      <w:r>
-        <w:rPr>
-          <w:lang w:val="en-US"/>
-        </w:rPr>
-        <w:t xml:space="preserve">Look for </w:t>
-      </w:r>
-      <w:r>
-        <w:rPr>
-          <w:b/>
-          <w:bCs/>
-        </w:rPr>
-        <w:t>IdP SAML metadata</w:t>
-      </w:r>
-      <w:r>
-        <w:rPr>
-          <w:b/>
-          <w:bCs/>
-        </w:rPr>
-        <w:t xml:space="preserve"> </w:t>
-      </w:r>
-      <w:r>
-        <w:t>and upload the Federation Metadata XML file there</w:t>
-      </w:r>
-    </w:p>
-    <w:p>
-      <w:pPr>
-        <w:rPr>
-          <w:lang w:val="en-US"/>
-        </w:rPr>
-      </w:pPr>
-      <w:r>
-        <w:rPr>
-          <w:noProof/>
-          <w:lang w:val="en-US"/>
-        </w:rPr>
-        <w:drawing>
-          <wp:inline distT="0" distB="0" distL="0" distR="0" wp14:anchorId="5D97657B" wp14:editId="141CFF38">
-            <wp:extent cx="5731510" cy="1732915"/>
-            <wp:effectExtent l="0" t="0" r="2540" b="635"/>
-            <wp:docPr id="149751115" name="Picture 1"/>
-            <wp:cNvGraphicFramePr>
-              <a:graphicFrameLocks xmlns:a="http://schemas.openxmlformats.org/drawingml/2006/main" noChangeAspect="1"/>
-            </wp:cNvGraphicFramePr>
-            <a:graphic xmlns:a="http://schemas.openxmlformats.org/drawingml/2006/main">
-              <a:graphicData uri="http://schemas.openxmlformats.org/drawingml/2006/picture">
-                <pic:pic xmlns:pic="http://schemas.openxmlformats.org/drawingml/2006/picture">
-                  <pic:nvPicPr>
-                    <pic:cNvPr id="149751115" name=""/>
-                    <pic:cNvPicPr/>
-                  </pic:nvPicPr>
-                  <pic:blipFill>
-                    <a:blip r:embed="rId25"/>
-                    <a:stretch>
-                      <a:fillRect/>
-                    </a:stretch>
-                  </pic:blipFill>
-                  <pic:spPr>
-                    <a:xfrm>
-                      <a:off x="0" y="0"/>
-                      <a:ext cx="5731510" cy="1732915"/>
-                    </a:xfrm>
-                    <a:prstGeom prst="rect">
-                      <a:avLst/>
-                    </a:prstGeom>
-                  </pic:spPr>
-                </pic:pic>
-              </a:graphicData>
-            </a:graphic>
-          </wp:inline>
-        </w:drawing>
-      </w:r>
-    </w:p>
-    <w:p>
-      <w:pPr>
-        <w:rPr>
-          <w:lang w:val="en-US"/>
-        </w:rPr>
-      </w:pPr>
-      <w:r>
-        <w:rPr>
-          <w:noProof/>
-          <w:lang w:val="en-US"/>
-        </w:rPr>
-        <w:drawing>
-          <wp:inline distT="0" distB="0" distL="0" distR="0" wp14:anchorId="3777D186" wp14:editId="0AADD4C7">
-            <wp:extent cx="5731510" cy="1047750"/>
-            <wp:effectExtent l="0" t="0" r="2540" b="0"/>
-            <wp:docPr id="1150849897" name="Picture 1"/>
-            <wp:cNvGraphicFramePr>
-              <a:graphicFrameLocks xmlns:a="http://schemas.openxmlformats.org/drawingml/2006/main" noChangeAspect="1"/>
-            </wp:cNvGraphicFramePr>
-            <a:graphic xmlns:a="http://schemas.openxmlformats.org/drawingml/2006/main">
-              <a:graphicData uri="http://schemas.openxmlformats.org/drawingml/2006/picture">
-                <pic:pic xmlns:pic="http://schemas.openxmlformats.org/drawingml/2006/picture">
-                  <pic:nvPicPr>
-                    <pic:cNvPr id="1150849897" name=""/>
-                    <pic:cNvPicPr/>
-                  </pic:nvPicPr>
-                  <pic:blipFill>
-                    <a:blip r:embed="rId26"/>
-                    <a:stretch>
-                      <a:fillRect/>
-                    </a:stretch>
-                  </pic:blipFill>
-                  <pic:spPr>
-                    <a:xfrm>
-                      <a:off x="0" y="0"/>
-                      <a:ext cx="5731510" cy="1047750"/>
-                    </a:xfrm>
-                    <a:prstGeom prst="rect">
-                      <a:avLst/>
-                    </a:prstGeom>
-                  </pic:spPr>
-                </pic:pic>
-              </a:graphicData>
-            </a:graphic>
-          </wp:inline>
-        </w:drawing>
-      </w:r>
-    </w:p>
-    <w:p>
-      <w:pPr>
-        <w:pStyle w:val="ListParagraph"/>
-        <w:numPr>
-          <w:ilvl w:val="0"/>
-          <w:numId w:val="3"/>
-        </w:numPr>
-        <w:rPr>
-          <w:lang w:val="en-US"/>
-        </w:rPr>
-      </w:pPr>
-      <w:r>
-        <w:rPr>
-          <w:lang w:val="en-US"/>
-        </w:rPr>
-        <w:t>Click the next button to move on to confirming your changes</w:t>
-      </w:r>
-    </w:p>
-    <w:p>
-      <w:pPr>
-        <w:pStyle w:val="ListParagraph"/>
-        <w:numPr>
-          <w:ilvl w:val="0"/>
-          <w:numId w:val="3"/>
-        </w:numPr>
-        <w:rPr>
-          <w:lang w:val="en-US"/>
-        </w:rPr>
-      </w:pPr>
-      <w:r>
-        <w:rPr>
-          <w:lang w:val="en-US"/>
-        </w:rPr>
-        <w:t>Type ACCEPT into the confirmation box at the bottom and then click the “change Identity source" button</w:t>
-      </w:r>
-    </w:p>
-    <w:p>
-      <w:pPr>
-        <w:rPr>
-          <w:lang w:val="en-US"/>
-        </w:rPr>
-      </w:pPr>
-      <w:r>
-        <w:rPr>
-          <w:noProof/>
-          <w:lang w:val="en-US"/>
-        </w:rPr>
-        <w:lastRenderedPageBreak/>
-        <w:drawing>
-          <wp:inline distT="0" distB="0" distL="0" distR="0" wp14:anchorId="49C89AA1" wp14:editId="2FE0DF24">
-            <wp:extent cx="5731510" cy="638810"/>
-            <wp:effectExtent l="0" t="0" r="2540" b="8890"/>
-            <wp:docPr id="370675490" name="Picture 1"/>
-            <wp:cNvGraphicFramePr>
-              <a:graphicFrameLocks xmlns:a="http://schemas.openxmlformats.org/drawingml/2006/main" noChangeAspect="1"/>
-            </wp:cNvGraphicFramePr>
-            <a:graphic xmlns:a="http://schemas.openxmlformats.org/drawingml/2006/main">
-              <a:graphicData uri="http://schemas.openxmlformats.org/drawingml/2006/picture">
-                <pic:pic xmlns:pic="http://schemas.openxmlformats.org/drawingml/2006/picture">
-                  <pic:nvPicPr>
-                    <pic:cNvPr id="370675490" name=""/>
-                    <pic:cNvPicPr/>
-                  </pic:nvPicPr>
-                  <pic:blipFill>
-                    <a:blip r:embed="rId27"/>
-                    <a:stretch>
-                      <a:fillRect/>
-                    </a:stretch>
-                  </pic:blipFill>
-                  <pic:spPr>
-                    <a:xfrm>
-                      <a:off x="0" y="0"/>
-                      <a:ext cx="5731510" cy="638810"/>
-                    </a:xfrm>
-                    <a:prstGeom prst="rect">
-                      <a:avLst/>
-                    </a:prstGeom>
-                  </pic:spPr>
-                </pic:pic>
-              </a:graphicData>
-            </a:graphic>
-          </wp:inline>
-        </w:drawing>
-      </w:r>
-    </w:p>
-    <w:p>
-      <w:pPr>
-        <w:rPr>
-          <w:lang w:val="en-US"/>
-        </w:rPr>
-      </w:pPr>
-      <w:r>
-        <w:rPr>
-          <w:lang w:val="en-US"/>
-        </w:rPr>
-        <w:t>Manual step for AWS SSO for Entra is not complete</w:t>
-      </w:r>
-      <w:r>
-        <w:rPr>
-          <w:lang w:val="en-US"/>
-        </w:rPr>
-        <w:t xml:space="preserve"> Now run C21 to finish SSO Corp setup</w:t>
+        <w:t>Save your email address and password in a secure place so you can access it later.</w:t>
       </w:r>
     </w:p>
     <w:sectPr>

</xml_diff>